<commit_message>
docs: add publication-grade experimental result graphs (Figures 3-6) and update all manuscript formats
</commit_message>
<xml_diff>
--- a/experiment/papers/Blinded_Manuscript_EAIT.docx
+++ b/experiment/papers/Blinded_Manuscript_EAIT.docx
@@ -10608,6 +10608,77 @@
     </w:p>
     <w:p>
       <w:pPr>
+        <w:spacing w:before="0" w:after="120" w:line="276" w:lineRule="auto"/>
+      </w:pPr>
+      <w:r>
+        <w:rPr>
+          <w:rFonts w:ascii="Times New Roman" w:hAnsi="Times New Roman"/>
+          <w:b w:val="0"/>
+          <w:i w:val="0"/>
+          <w:color w:val="1A1A1A"/>
+          <w:sz w:val="22"/>
+        </w:rPr>
+        <w:t>Figure 3 presents the multi-judge evaluation profile, overall pedagogical usability breakdown, and topic-level scores across curriculum modules.</w:t>
+      </w:r>
+    </w:p>
+    <w:p>
+      <w:pPr>
+        <w:spacing w:before="160" w:after="40"/>
+        <w:jc w:val="center"/>
+      </w:pPr>
+      <w:r>
+        <w:drawing>
+          <wp:inline xmlns:a="http://schemas.openxmlformats.org/drawingml/2006/main" xmlns:pic="http://schemas.openxmlformats.org/drawingml/2006/picture">
+            <wp:extent cx="5669280" cy="2525276"/>
+            <wp:docPr id="3" name="Picture 3"/>
+            <wp:cNvGraphicFramePr>
+              <a:graphicFrameLocks noChangeAspect="1"/>
+            </wp:cNvGraphicFramePr>
+            <a:graphic>
+              <a:graphicData uri="http://schemas.openxmlformats.org/drawingml/2006/picture">
+                <pic:pic>
+                  <pic:nvPicPr>
+                    <pic:cNvPr id="0" name="e1_quality_evaluation.png"/>
+                    <pic:cNvPicPr/>
+                  </pic:nvPicPr>
+                  <pic:blipFill>
+                    <a:blip r:embed="rId11"/>
+                    <a:stretch>
+                      <a:fillRect/>
+                    </a:stretch>
+                  </pic:blipFill>
+                  <pic:spPr>
+                    <a:xfrm>
+                      <a:off x="0" y="0"/>
+                      <a:ext cx="5669280" cy="2525276"/>
+                    </a:xfrm>
+                    <a:prstGeom prst="rect"/>
+                  </pic:spPr>
+                </pic:pic>
+              </a:graphicData>
+            </a:graphic>
+          </wp:inline>
+        </w:drawing>
+      </w:r>
+    </w:p>
+    <w:p>
+      <w:pPr>
+        <w:spacing w:before="40" w:after="200"/>
+        <w:jc w:val="center"/>
+      </w:pPr>
+      <w:r>
+        <w:rPr>
+          <w:rFonts w:ascii="Times New Roman" w:hAnsi="Times New Roman"/>
+          <w:b w:val="0"/>
+          <w:i/>
+          <w:color w:val="475569"/>
+          <w:sz w:val="19"/>
+        </w:rPr>
+        <w:t>Figure 3: Multi-judge pedagogical quality validation across 100 generated Python MCQs (Experiment 1). (a) Mean Likert scores across the five evaluation dimensions evaluated by OpenAI GPT-4o, Google Gemini 2.5 Flash, and senior CS faculty, plotted against the 4.0 proficiency benchmark with Intraclass Correlation Coefficients (ICC). (b) Overall usability distribution showing an 80.0% acceptance rate without major revision. (c) Pedagogical score breakdown across curriculum modules.</w:t>
+      </w:r>
+    </w:p>
+    <w:p>
+      <w:pPr>
         <w:keepNext/>
         <w:spacing w:before="200" w:after="60"/>
       </w:pPr>
@@ -13822,6 +13893,105 @@
           <w:sz w:val="22"/>
         </w:rPr>
         <w:t>), and in the optimized steady-state pipeline, LLM generation dominates end-to-end latency (&gt;99%), limiting the effect of further preprocessing optimization on interactive response time. The practical value of incremental indexing is therefore resource preservation—reducing GPU forward passes by 99.8% to keep compute cores and VRAM bus bandwidth open for autoregressive generation—rather than dramatically compressing isolated single-item response times.</w:t>
+      </w:r>
+    </w:p>
+    <w:p>
+      <w:pPr>
+        <w:spacing w:before="0" w:after="120" w:line="276" w:lineRule="auto"/>
+      </w:pPr>
+      <w:r>
+        <w:rPr>
+          <w:rFonts w:ascii="Times New Roman" w:hAnsi="Times New Roman"/>
+          <w:b w:val="0"/>
+          <w:i w:val="0"/>
+          <w:color w:val="1A1A1A"/>
+          <w:sz w:val="22"/>
+        </w:rPr>
+        <w:t>Figure 4 illustrates the component-level latency decomposition and context budgeting trade-offs across configurations.</w:t>
+      </w:r>
+    </w:p>
+    <w:p>
+      <w:pPr>
+        <w:spacing w:before="160" w:after="40"/>
+        <w:jc w:val="center"/>
+      </w:pPr>
+      <w:r>
+        <w:drawing>
+          <wp:inline xmlns:a="http://schemas.openxmlformats.org/drawingml/2006/main" xmlns:pic="http://schemas.openxmlformats.org/drawingml/2006/picture">
+            <wp:extent cx="5669280" cy="2197144"/>
+            <wp:docPr id="4" name="Picture 4"/>
+            <wp:cNvGraphicFramePr>
+              <a:graphicFrameLocks noChangeAspect="1"/>
+            </wp:cNvGraphicFramePr>
+            <a:graphic>
+              <a:graphicData uri="http://schemas.openxmlformats.org/drawingml/2006/picture">
+                <pic:pic>
+                  <pic:nvPicPr>
+                    <pic:cNvPr id="0" name="e2_pipeline_ablation.png"/>
+                    <pic:cNvPicPr/>
+                  </pic:nvPicPr>
+                  <pic:blipFill>
+                    <a:blip r:embed="rId12"/>
+                    <a:stretch>
+                      <a:fillRect/>
+                    </a:stretch>
+                  </pic:blipFill>
+                  <pic:spPr>
+                    <a:xfrm>
+                      <a:off x="0" y="0"/>
+                      <a:ext cx="5669280" cy="2197144"/>
+                    </a:xfrm>
+                    <a:prstGeom prst="rect"/>
+                  </pic:spPr>
+                </pic:pic>
+              </a:graphicData>
+            </a:graphic>
+          </wp:inline>
+        </w:drawing>
+      </w:r>
+    </w:p>
+    <w:p>
+      <w:pPr>
+        <w:spacing w:before="40" w:after="200"/>
+        <w:jc w:val="center"/>
+      </w:pPr>
+      <w:r>
+        <w:rPr>
+          <w:rFonts w:ascii="Times New Roman" w:hAnsi="Times New Roman"/>
+          <w:b w:val="0"/>
+          <w:i/>
+          <w:color w:val="475569"/>
+          <w:sz w:val="19"/>
+        </w:rPr>
+        <w:t>Figure 4: Pipeline component ablation and latency breakdown (Experiment 2). (a) Component-level latency decomposition (</w:t>
+      </w:r>
+      <w:r>
+        <w:rPr>
+          <w:rFonts w:ascii="Times New Roman" w:hAnsi="Times New Roman"/>
+          <w:i/>
+          <w:color w:val="475569"/>
+          <w:sz w:val="19"/>
+        </w:rPr>
+        <w:t>T</w:t>
+      </w:r>
+      <w:r>
+        <w:rPr>
+          <w:rFonts w:ascii="Times New Roman" w:hAnsi="Times New Roman"/>
+          <w:color w:val="475569"/>
+          <w:sz w:val="19"/>
+          <w:vertAlign w:val="subscript"/>
+        </w:rPr>
+        <w:t>E2E</w:t>
+      </w:r>
+      <w:r>
+        <w:rPr>
+          <w:rFonts w:ascii="Times New Roman" w:hAnsi="Times New Roman"/>
+          <w:b w:val="0"/>
+          <w:i/>
+          <w:color w:val="475569"/>
+          <w:sz w:val="19"/>
+        </w:rPr>
+        <w:t>) across baseline (Config A), proposed INACON pipeline (Config B), static context (Config C), and zero-shot generation (Config D), illustrating Amdahl's Law constraint where local LLM autoregressive decoding dominates &gt;96.5% of execution time. (b) Trade-off between prompt context tokens and SHA-256 chunk embedding cache-hit rates, highlighting the 72.2% context compression achieved by bounded semantic retrieval.</w:t>
       </w:r>
     </w:p>
     <w:p>
@@ -15270,6 +15440,275 @@
     </w:p>
     <w:p>
       <w:pPr>
+        <w:spacing w:before="0" w:after="120" w:line="276" w:lineRule="auto"/>
+      </w:pPr>
+      <w:r>
+        <w:rPr>
+          <w:rFonts w:ascii="Times New Roman" w:hAnsi="Times New Roman"/>
+          <w:b w:val="0"/>
+          <w:i w:val="0"/>
+          <w:color w:val="1A1A1A"/>
+          <w:sz w:val="22"/>
+        </w:rPr>
+        <w:t>Figure 5 plots the indexing latency scaling curves and acceleration factors under incremental updates.</w:t>
+      </w:r>
+    </w:p>
+    <w:p>
+      <w:pPr>
+        <w:spacing w:before="160" w:after="40"/>
+        <w:jc w:val="center"/>
+      </w:pPr>
+      <w:r>
+        <w:drawing>
+          <wp:inline xmlns:a="http://schemas.openxmlformats.org/drawingml/2006/main" xmlns:pic="http://schemas.openxmlformats.org/drawingml/2006/picture">
+            <wp:extent cx="5669280" cy="2559442"/>
+            <wp:docPr id="5" name="Picture 5"/>
+            <wp:cNvGraphicFramePr>
+              <a:graphicFrameLocks noChangeAspect="1"/>
+            </wp:cNvGraphicFramePr>
+            <a:graphic>
+              <a:graphicData uri="http://schemas.openxmlformats.org/drawingml/2006/picture">
+                <pic:pic>
+                  <pic:nvPicPr>
+                    <pic:cNvPr id="0" name="e3_indexing_scalability.png"/>
+                    <pic:cNvPicPr/>
+                  </pic:nvPicPr>
+                  <pic:blipFill>
+                    <a:blip r:embed="rId13"/>
+                    <a:stretch>
+                      <a:fillRect/>
+                    </a:stretch>
+                  </pic:blipFill>
+                  <pic:spPr>
+                    <a:xfrm>
+                      <a:off x="0" y="0"/>
+                      <a:ext cx="5669280" cy="2559442"/>
+                    </a:xfrm>
+                    <a:prstGeom prst="rect"/>
+                  </pic:spPr>
+                </pic:pic>
+              </a:graphicData>
+            </a:graphic>
+          </wp:inline>
+        </w:drawing>
+      </w:r>
+    </w:p>
+    <w:p>
+      <w:pPr>
+        <w:spacing w:before="40" w:after="200"/>
+        <w:jc w:val="center"/>
+      </w:pPr>
+      <w:r>
+        <w:rPr>
+          <w:rFonts w:ascii="Times New Roman" w:hAnsi="Times New Roman"/>
+          <w:b w:val="0"/>
+          <w:i/>
+          <w:color w:val="475569"/>
+          <w:sz w:val="19"/>
+        </w:rPr>
+        <w:t xml:space="preserve">Figure 5: Knowledge Base indexing latency and scalability across curriculum progression scales and update ratios (Experiment 3). (a) Indexing latency </w:t>
+      </w:r>
+      <w:r>
+        <w:rPr>
+          <w:rFonts w:ascii="Times New Roman" w:hAnsi="Times New Roman"/>
+          <w:i/>
+          <w:color w:val="475569"/>
+          <w:sz w:val="19"/>
+        </w:rPr>
+        <w:t>T</w:t>
+      </w:r>
+      <w:r>
+        <w:rPr>
+          <w:rFonts w:ascii="Times New Roman" w:hAnsi="Times New Roman"/>
+          <w:color w:val="475569"/>
+          <w:sz w:val="19"/>
+          <w:vertAlign w:val="subscript"/>
+        </w:rPr>
+        <w:t>KB</w:t>
+      </w:r>
+      <w:r>
+        <w:rPr>
+          <w:rFonts w:ascii="Times New Roman" w:hAnsi="Times New Roman"/>
+          <w:b w:val="0"/>
+          <w:i/>
+          <w:color w:val="475569"/>
+          <w:sz w:val="19"/>
+        </w:rPr>
+        <w:t xml:space="preserve"> (log scale) from 1 to 7 modules under update conditions </w:t>
+      </w:r>
+      <w:r>
+        <w:rPr>
+          <w:rFonts w:ascii="Times New Roman" w:hAnsi="Times New Roman"/>
+          <w:i/>
+          <w:color w:val="475569"/>
+          <w:sz w:val="19"/>
+        </w:rPr>
+        <w:t>U</w:t>
+      </w:r>
+      <w:r>
+        <w:rPr>
+          <w:rFonts w:ascii="Times New Roman" w:hAnsi="Times New Roman"/>
+          <w:color w:val="475569"/>
+          <w:sz w:val="19"/>
+          <w:vertAlign w:val="subscript"/>
+        </w:rPr>
+        <w:t>0</w:t>
+      </w:r>
+      <w:r>
+        <w:rPr>
+          <w:rFonts w:ascii="Times New Roman" w:hAnsi="Times New Roman"/>
+          <w:b w:val="0"/>
+          <w:i/>
+          <w:color w:val="475569"/>
+          <w:sz w:val="19"/>
+        </w:rPr>
+        <w:t xml:space="preserve"> through </w:t>
+      </w:r>
+      <w:r>
+        <w:rPr>
+          <w:rFonts w:ascii="Times New Roman" w:hAnsi="Times New Roman"/>
+          <w:i/>
+          <w:color w:val="475569"/>
+          <w:sz w:val="19"/>
+        </w:rPr>
+        <w:t>U</w:t>
+      </w:r>
+      <w:r>
+        <w:rPr>
+          <w:rFonts w:ascii="Times New Roman" w:hAnsi="Times New Roman"/>
+          <w:color w:val="475569"/>
+          <w:sz w:val="19"/>
+          <w:vertAlign w:val="subscript"/>
+        </w:rPr>
+        <w:t>100</w:t>
+      </w:r>
+      <w:r>
+        <w:rPr>
+          <w:rFonts w:ascii="Times New Roman" w:hAnsi="Times New Roman"/>
+          <w:b w:val="0"/>
+          <w:i/>
+          <w:color w:val="475569"/>
+          <w:sz w:val="19"/>
+        </w:rPr>
+        <w:t>, showing sub-millisecond steady-state performance (</w:t>
+      </w:r>
+      <w:r>
+        <w:rPr>
+          <w:rFonts w:ascii="Times New Roman" w:hAnsi="Times New Roman"/>
+          <w:i/>
+          <w:color w:val="475569"/>
+          <w:sz w:val="19"/>
+        </w:rPr>
+        <w:t>T</w:t>
+      </w:r>
+      <w:r>
+        <w:rPr>
+          <w:rFonts w:ascii="Times New Roman" w:hAnsi="Times New Roman"/>
+          <w:color w:val="475569"/>
+          <w:sz w:val="19"/>
+          <w:vertAlign w:val="subscript"/>
+        </w:rPr>
+        <w:t>KB</w:t>
+      </w:r>
+      <w:r>
+        <w:rPr>
+          <w:rFonts w:ascii="Times New Roman" w:hAnsi="Times New Roman"/>
+          <w:color w:val="475569"/>
+          <w:sz w:val="19"/>
+        </w:rPr>
+        <w:t xml:space="preserve"> \</w:t>
+      </w:r>
+      <w:r>
+        <w:rPr>
+          <w:rFonts w:ascii="Times New Roman" w:hAnsi="Times New Roman"/>
+          <w:color w:val="475569"/>
+          <w:sz w:val="19"/>
+        </w:rPr>
+        <w:t>leq</w:t>
+      </w:r>
+      <w:r>
+        <w:rPr>
+          <w:rFonts w:ascii="Times New Roman" w:hAnsi="Times New Roman"/>
+          <w:color w:val="475569"/>
+          <w:sz w:val="19"/>
+        </w:rPr>
+        <w:t xml:space="preserve"> 0.28</w:t>
+      </w:r>
+      <w:r>
+        <w:rPr>
+          <w:rFonts w:ascii="Times New Roman" w:hAnsi="Times New Roman"/>
+          <w:color w:val="475569"/>
+          <w:sz w:val="19"/>
+        </w:rPr>
+        <w:t xml:space="preserve"> ms</w:t>
+      </w:r>
+      <w:r>
+        <w:rPr>
+          <w:rFonts w:ascii="Times New Roman" w:hAnsi="Times New Roman"/>
+          <w:b w:val="0"/>
+          <w:i/>
+          <w:color w:val="475569"/>
+          <w:sz w:val="19"/>
+        </w:rPr>
+        <w:t>). (b) Empirical speedup factor of SHA-256 incremental embedding reuse over cold rebuilds (</w:t>
+      </w:r>
+      <w:r>
+        <w:rPr>
+          <w:rFonts w:ascii="Times New Roman" w:hAnsi="Times New Roman"/>
+          <w:i/>
+          <w:color w:val="475569"/>
+          <w:sz w:val="19"/>
+        </w:rPr>
+        <w:t>U</w:t>
+      </w:r>
+      <w:r>
+        <w:rPr>
+          <w:rFonts w:ascii="Times New Roman" w:hAnsi="Times New Roman"/>
+          <w:color w:val="475569"/>
+          <w:sz w:val="19"/>
+          <w:vertAlign w:val="subscript"/>
+        </w:rPr>
+        <w:t>100</w:t>
+      </w:r>
+      <w:r>
+        <w:rPr>
+          <w:rFonts w:ascii="Times New Roman" w:hAnsi="Times New Roman"/>
+          <w:color w:val="475569"/>
+          <w:sz w:val="19"/>
+        </w:rPr>
+        <w:t xml:space="preserve"> / </w:t>
+      </w:r>
+      <w:r>
+        <w:rPr>
+          <w:rFonts w:ascii="Times New Roman" w:hAnsi="Times New Roman"/>
+          <w:i/>
+          <w:color w:val="475569"/>
+          <w:sz w:val="19"/>
+        </w:rPr>
+        <w:t>U</w:t>
+      </w:r>
+      <w:r>
+        <w:rPr>
+          <w:rFonts w:ascii="Times New Roman" w:hAnsi="Times New Roman"/>
+          <w:color w:val="475569"/>
+          <w:sz w:val="19"/>
+          <w:vertAlign w:val="subscript"/>
+        </w:rPr>
+        <w:t>0</w:t>
+      </w:r>
+      <w:r>
+        <w:rPr>
+          <w:rFonts w:ascii="Times New Roman" w:hAnsi="Times New Roman"/>
+          <w:b w:val="0"/>
+          <w:i/>
+          <w:color w:val="475569"/>
+          <w:sz w:val="19"/>
+        </w:rPr>
+        <w:t>), scaling from 4,921.1× to 37,008.4×.</w:t>
+      </w:r>
+    </w:p>
+    <w:p>
+      <w:pPr>
         <w:keepNext/>
         <w:spacing w:before="200" w:after="60"/>
       </w:pPr>
@@ -16862,6 +17301,184 @@
       <w:pPr>
         <w:spacing w:before="0" w:after="120"/>
       </w:pPr>
+    </w:p>
+    <w:p>
+      <w:pPr>
+        <w:spacing w:before="0" w:after="120" w:line="276" w:lineRule="auto"/>
+      </w:pPr>
+      <w:r>
+        <w:rPr>
+          <w:rFonts w:ascii="Times New Roman" w:hAnsi="Times New Roman"/>
+          <w:b w:val="0"/>
+          <w:i w:val="0"/>
+          <w:color w:val="1A1A1A"/>
+          <w:sz w:val="22"/>
+        </w:rPr>
+        <w:t>Figure 6 delineates the throughput ceiling, latency scaling envelope, and hardware resource footprint under concurrent load.</w:t>
+      </w:r>
+    </w:p>
+    <w:p>
+      <w:pPr>
+        <w:spacing w:before="160" w:after="40"/>
+        <w:jc w:val="center"/>
+      </w:pPr>
+      <w:r>
+        <w:drawing>
+          <wp:inline xmlns:a="http://schemas.openxmlformats.org/drawingml/2006/main" xmlns:pic="http://schemas.openxmlformats.org/drawingml/2006/picture">
+            <wp:extent cx="5669280" cy="2230220"/>
+            <wp:docPr id="6" name="Picture 6"/>
+            <wp:cNvGraphicFramePr>
+              <a:graphicFrameLocks noChangeAspect="1"/>
+            </wp:cNvGraphicFramePr>
+            <a:graphic>
+              <a:graphicData uri="http://schemas.openxmlformats.org/drawingml/2006/picture">
+                <pic:pic>
+                  <pic:nvPicPr>
+                    <pic:cNvPr id="0" name="e4_concurrency_envelope.png"/>
+                    <pic:cNvPicPr/>
+                  </pic:nvPicPr>
+                  <pic:blipFill>
+                    <a:blip r:embed="rId14"/>
+                    <a:stretch>
+                      <a:fillRect/>
+                    </a:stretch>
+                  </pic:blipFill>
+                  <pic:spPr>
+                    <a:xfrm>
+                      <a:off x="0" y="0"/>
+                      <a:ext cx="5669280" cy="2230220"/>
+                    </a:xfrm>
+                    <a:prstGeom prst="rect"/>
+                  </pic:spPr>
+                </pic:pic>
+              </a:graphicData>
+            </a:graphic>
+          </wp:inline>
+        </w:drawing>
+      </w:r>
+    </w:p>
+    <w:p>
+      <w:pPr>
+        <w:spacing w:before="40" w:after="200"/>
+        <w:jc w:val="center"/>
+      </w:pPr>
+      <w:r>
+        <w:rPr>
+          <w:rFonts w:ascii="Times New Roman" w:hAnsi="Times New Roman"/>
+          <w:b w:val="0"/>
+          <w:i/>
+          <w:color w:val="475569"/>
+          <w:sz w:val="19"/>
+        </w:rPr>
+        <w:t xml:space="preserve">Figure 6: Single-GPU concurrency operating envelope and resource headroom on a dedicated NVIDIA RTX 3090 host (Experiment 4). (a) Aggregate throughput in questions/min across concurrency tiers </w:t>
+      </w:r>
+      <w:r>
+        <w:rPr>
+          <w:rFonts w:ascii="Times New Roman" w:hAnsi="Times New Roman"/>
+          <w:i/>
+          <w:color w:val="475569"/>
+          <w:sz w:val="19"/>
+        </w:rPr>
+        <w:t>C</w:t>
+      </w:r>
+      <w:r>
+        <w:rPr>
+          <w:rFonts w:ascii="Times New Roman" w:hAnsi="Times New Roman"/>
+          <w:color w:val="475569"/>
+          <w:sz w:val="19"/>
+        </w:rPr>
+        <w:t xml:space="preserve"> = 1 … 20</w:t>
+      </w:r>
+      <w:r>
+        <w:rPr>
+          <w:rFonts w:ascii="Times New Roman" w:hAnsi="Times New Roman"/>
+          <w:b w:val="0"/>
+          <w:i/>
+          <w:color w:val="475569"/>
+          <w:sz w:val="19"/>
+        </w:rPr>
+        <w:t xml:space="preserve"> under standardized 5-question request batches, showing saturation at 43.8–49.2 Q/min. (b) Median (P50) and tail (P95) latency scaling, highlighting the interactive faculty authoring envelope (</w:t>
+      </w:r>
+      <w:r>
+        <w:rPr>
+          <w:rFonts w:ascii="Times New Roman" w:hAnsi="Times New Roman"/>
+          <w:i/>
+          <w:color w:val="475569"/>
+          <w:sz w:val="19"/>
+        </w:rPr>
+        <w:t>C</w:t>
+      </w:r>
+      <w:r>
+        <w:rPr>
+          <w:rFonts w:ascii="Times New Roman" w:hAnsi="Times New Roman"/>
+          <w:color w:val="475569"/>
+          <w:sz w:val="19"/>
+        </w:rPr>
+        <w:t xml:space="preserve"> ≤ 5</w:t>
+      </w:r>
+      <w:r>
+        <w:rPr>
+          <w:rFonts w:ascii="Times New Roman" w:hAnsi="Times New Roman"/>
+          <w:b w:val="0"/>
+          <w:i/>
+          <w:color w:val="475569"/>
+          <w:sz w:val="19"/>
+        </w:rPr>
+        <w:t xml:space="preserve">, latency </w:t>
+      </w:r>
+      <w:r>
+        <w:rPr>
+          <w:rFonts w:ascii="Times New Roman" w:hAnsi="Times New Roman"/>
+          <w:color w:val="475569"/>
+          <w:sz w:val="19"/>
+        </w:rPr>
+        <w:t>≤ 3.56</w:t>
+      </w:r>
+      <w:r>
+        <w:rPr>
+          <w:rFonts w:ascii="Times New Roman" w:hAnsi="Times New Roman"/>
+          <w:color w:val="475569"/>
+          <w:sz w:val="19"/>
+        </w:rPr>
+        <w:t xml:space="preserve"> s</w:t>
+      </w:r>
+      <w:r>
+        <w:rPr>
+          <w:rFonts w:ascii="Times New Roman" w:hAnsi="Times New Roman"/>
+          <w:b w:val="0"/>
+          <w:i/>
+          <w:color w:val="475569"/>
+          <w:sz w:val="19"/>
+        </w:rPr>
+        <w:t>) versus queued batch saturation (</w:t>
+      </w:r>
+      <w:r>
+        <w:rPr>
+          <w:rFonts w:ascii="Times New Roman" w:hAnsi="Times New Roman"/>
+          <w:i/>
+          <w:color w:val="475569"/>
+          <w:sz w:val="19"/>
+        </w:rPr>
+        <w:t>C</w:t>
+      </w:r>
+      <w:r>
+        <w:rPr>
+          <w:rFonts w:ascii="Times New Roman" w:hAnsi="Times New Roman"/>
+          <w:color w:val="475569"/>
+          <w:sz w:val="19"/>
+        </w:rPr>
+        <w:t xml:space="preserve"> ≥ 10</w:t>
+      </w:r>
+      <w:r>
+        <w:rPr>
+          <w:rFonts w:ascii="Times New Roman" w:hAnsi="Times New Roman"/>
+          <w:b w:val="0"/>
+          <w:i/>
+          <w:color w:val="475569"/>
+          <w:sz w:val="19"/>
+        </w:rPr>
+        <w:t>). (c) Host resource allocation showing mean GPU compute utilization and peak VRAM safely contained at 13.44 GB against the 24 GB hardware ceiling.</w:t>
+      </w:r>
     </w:p>
     <w:p>
       <w:pPr>

</xml_diff>

<commit_message>
docs: align manuscript with Springer EAIT journal standards (eliminate bullet points, streamline to 8 narrative sections, add 5 recent EAIT reference papers)
</commit_message>
<xml_diff>
--- a/experiment/papers/Blinded_Manuscript_EAIT.docx
+++ b/experiment/papers/Blinded_Manuscript_EAIT.docx
@@ -1927,14 +1927,8 @@
           <w:color w:val="1A1A1A"/>
           <w:sz w:val="22"/>
         </w:rPr>
-        <w:t>The prompt enforces a strict JSON output schema containing five mandatory fields:</w:t>
-      </w:r>
-    </w:p>
-    <w:p>
-      <w:pPr>
-        <w:pStyle w:val="ListNumber"/>
-        <w:spacing w:before="20" w:after="40" w:line="276" w:lineRule="auto"/>
-      </w:pPr>
+        <w:t xml:space="preserve">The prompt enforces a strict JSON output schema containing five mandatory structured attributes: (1) </w:t>
+      </w:r>
       <w:r>
         <w:rPr>
           <w:rFonts w:ascii="Courier New" w:hAnsi="Courier New"/>
@@ -1951,7 +1945,7 @@
           <w:color w:val="1A1A1A"/>
           <w:sz w:val="22"/>
         </w:rPr>
-        <w:t>: The natural-language question stem, including optional markdown-formatted code blocks (</w:t>
+        <w:t xml:space="preserve">, providing the natural-language question stem alongside optional syntax-highlighted code blocks; (2) </w:t>
       </w:r>
       <w:r>
         <w:rPr>
@@ -1959,7 +1953,17 @@
           <w:color w:val="0F172A"/>
           <w:sz w:val="21"/>
         </w:rPr>
-        <w:t xml:space="preserve"> </w:t>
+        <w:t>choices</w:t>
+      </w:r>
+      <w:r>
+        <w:rPr>
+          <w:rFonts w:ascii="Times New Roman" w:hAnsi="Times New Roman"/>
+          <w:b w:val="0"/>
+          <w:i w:val="0"/>
+          <w:color w:val="1A1A1A"/>
+          <w:sz w:val="22"/>
+        </w:rPr>
+        <w:t xml:space="preserve">, specifying an array of exactly four mutually exclusive option strings; (3) </w:t>
       </w:r>
       <w:r>
         <w:rPr>
@@ -1967,6 +1971,52 @@
           <w:color w:val="0F172A"/>
           <w:sz w:val="21"/>
         </w:rPr>
+        <w:t>correct_index</w:t>
+      </w:r>
+      <w:r>
+        <w:rPr>
+          <w:rFonts w:ascii="Times New Roman" w:hAnsi="Times New Roman"/>
+          <w:b w:val="0"/>
+          <w:i w:val="0"/>
+          <w:color w:val="1A1A1A"/>
+          <w:sz w:val="22"/>
+        </w:rPr>
+        <w:t>, designating an integer index (</w:t>
+      </w:r>
+      <w:r>
+        <w:rPr>
+          <w:rFonts w:ascii="Times New Roman" w:hAnsi="Times New Roman"/>
+          <w:color w:val="1A1A1A"/>
+          <w:sz w:val="22"/>
+        </w:rPr>
+        <w:t xml:space="preserve">0 ≤ </w:t>
+      </w:r>
+      <w:r>
+        <w:rPr>
+          <w:rFonts w:ascii="Times New Roman" w:hAnsi="Times New Roman"/>
+          <w:i/>
+          <w:color w:val="1A1A1A"/>
+          <w:sz w:val="22"/>
+        </w:rPr>
+        <w:t>i</w:t>
+      </w:r>
+      <w:r>
+        <w:rPr>
+          <w:rFonts w:ascii="Times New Roman" w:hAnsi="Times New Roman"/>
+          <w:color w:val="1A1A1A"/>
+          <w:sz w:val="22"/>
+        </w:rPr>
+        <w:t xml:space="preserve"> ≤ 3</w:t>
+      </w:r>
+      <w:r>
+        <w:rPr>
+          <w:rFonts w:ascii="Times New Roman" w:hAnsi="Times New Roman"/>
+          <w:b w:val="0"/>
+          <w:i w:val="0"/>
+          <w:color w:val="1A1A1A"/>
+          <w:sz w:val="22"/>
+        </w:rPr>
+        <w:t xml:space="preserve">) specifying the single valid key; (4) </w:t>
       </w:r>
       <w:r>
         <w:rPr>
@@ -1974,7 +2024,17 @@
           <w:color w:val="0F172A"/>
           <w:sz w:val="21"/>
         </w:rPr>
-        <w:t xml:space="preserve">python ... </w:t>
+        <w:t>explanation</w:t>
+      </w:r>
+      <w:r>
+        <w:rPr>
+          <w:rFonts w:ascii="Times New Roman" w:hAnsi="Times New Roman"/>
+          <w:b w:val="0"/>
+          <w:i w:val="0"/>
+          <w:color w:val="1A1A1A"/>
+          <w:sz w:val="22"/>
+        </w:rPr>
+        <w:t xml:space="preserve">, detailing a pedagogical explanation justifying the designated key and diagnosing why alternative distractors fail; and (5) </w:t>
       </w:r>
       <w:r>
         <w:rPr>
@@ -1982,14 +2042,7 @@
           <w:color w:val="0F172A"/>
           <w:sz w:val="21"/>
         </w:rPr>
-      </w:r>
-      <w:r>
-        <w:rPr>
-          <w:rFonts w:ascii="Courier New" w:hAnsi="Courier New"/>
-          <w:color w:val="0F172A"/>
-          <w:sz w:val="21"/>
-        </w:rPr>
-        <w:t xml:space="preserve"> </w:t>
+        <w:t>source_chunk_ids</w:t>
       </w:r>
       <w:r>
         <w:rPr>
@@ -1999,138 +2052,7 @@
           <w:color w:val="1A1A1A"/>
           <w:sz w:val="22"/>
         </w:rPr>
-        <w:t>);</w:t>
-      </w:r>
-    </w:p>
-    <w:p>
-      <w:pPr>
-        <w:pStyle w:val="ListNumber"/>
-        <w:spacing w:before="20" w:after="40" w:line="276" w:lineRule="auto"/>
-      </w:pPr>
-      <w:r>
-        <w:rPr>
-          <w:rFonts w:ascii="Courier New" w:hAnsi="Courier New"/>
-          <w:color w:val="0F172A"/>
-          <w:sz w:val="21"/>
-        </w:rPr>
-        <w:t>choices</w:t>
-      </w:r>
-      <w:r>
-        <w:rPr>
-          <w:rFonts w:ascii="Times New Roman" w:hAnsi="Times New Roman"/>
-          <w:b w:val="0"/>
-          <w:i w:val="0"/>
-          <w:color w:val="1A1A1A"/>
-          <w:sz w:val="22"/>
-        </w:rPr>
-        <w:t>: An array of exactly four mutually exclusive option strings;</w:t>
-      </w:r>
-    </w:p>
-    <w:p>
-      <w:pPr>
-        <w:pStyle w:val="ListNumber"/>
-        <w:spacing w:before="20" w:after="40" w:line="276" w:lineRule="auto"/>
-      </w:pPr>
-      <w:r>
-        <w:rPr>
-          <w:rFonts w:ascii="Courier New" w:hAnsi="Courier New"/>
-          <w:color w:val="0F172A"/>
-          <w:sz w:val="21"/>
-        </w:rPr>
-        <w:t>correct_index</w:t>
-      </w:r>
-      <w:r>
-        <w:rPr>
-          <w:rFonts w:ascii="Times New Roman" w:hAnsi="Times New Roman"/>
-          <w:b w:val="0"/>
-          <w:i w:val="0"/>
-          <w:color w:val="1A1A1A"/>
-          <w:sz w:val="22"/>
-        </w:rPr>
-        <w:t>: An integer index (</w:t>
-      </w:r>
-      <w:r>
-        <w:rPr>
-          <w:rFonts w:ascii="Times New Roman" w:hAnsi="Times New Roman"/>
-          <w:color w:val="1A1A1A"/>
-          <w:sz w:val="22"/>
-        </w:rPr>
-        <w:t xml:space="preserve">0 ≤ </w:t>
-      </w:r>
-      <w:r>
-        <w:rPr>
-          <w:rFonts w:ascii="Times New Roman" w:hAnsi="Times New Roman"/>
-          <w:i/>
-          <w:color w:val="1A1A1A"/>
-          <w:sz w:val="22"/>
-        </w:rPr>
-        <w:t>i</w:t>
-      </w:r>
-      <w:r>
-        <w:rPr>
-          <w:rFonts w:ascii="Times New Roman" w:hAnsi="Times New Roman"/>
-          <w:color w:val="1A1A1A"/>
-          <w:sz w:val="22"/>
-        </w:rPr>
-        <w:t xml:space="preserve"> ≤ 3</w:t>
-      </w:r>
-      <w:r>
-        <w:rPr>
-          <w:rFonts w:ascii="Times New Roman" w:hAnsi="Times New Roman"/>
-          <w:b w:val="0"/>
-          <w:i w:val="0"/>
-          <w:color w:val="1A1A1A"/>
-          <w:sz w:val="22"/>
-        </w:rPr>
-        <w:t>) specifying the single correct answer;</w:t>
-      </w:r>
-    </w:p>
-    <w:p>
-      <w:pPr>
-        <w:pStyle w:val="ListNumber"/>
-        <w:spacing w:before="20" w:after="40" w:line="276" w:lineRule="auto"/>
-      </w:pPr>
-      <w:r>
-        <w:rPr>
-          <w:rFonts w:ascii="Courier New" w:hAnsi="Courier New"/>
-          <w:color w:val="0F172A"/>
-          <w:sz w:val="21"/>
-        </w:rPr>
-        <w:t>explanation</w:t>
-      </w:r>
-      <w:r>
-        <w:rPr>
-          <w:rFonts w:ascii="Times New Roman" w:hAnsi="Times New Roman"/>
-          <w:b w:val="0"/>
-          <w:i w:val="0"/>
-          <w:color w:val="1A1A1A"/>
-          <w:sz w:val="22"/>
-        </w:rPr>
-        <w:t>: A pedagogical explanation justifying the correct key and explaining distractor fallacies;</w:t>
-      </w:r>
-    </w:p>
-    <w:p>
-      <w:pPr>
-        <w:pStyle w:val="ListNumber"/>
-        <w:spacing w:before="20" w:after="40" w:line="276" w:lineRule="auto"/>
-      </w:pPr>
-      <w:r>
-        <w:rPr>
-          <w:rFonts w:ascii="Courier New" w:hAnsi="Courier New"/>
-          <w:color w:val="0F172A"/>
-          <w:sz w:val="21"/>
-        </w:rPr>
-        <w:t>source_chunk_ids</w:t>
-      </w:r>
-      <w:r>
-        <w:rPr>
-          <w:rFonts w:ascii="Times New Roman" w:hAnsi="Times New Roman"/>
-          <w:b w:val="0"/>
-          <w:i w:val="0"/>
-          <w:color w:val="1A1A1A"/>
-          <w:sz w:val="22"/>
-        </w:rPr>
-        <w:t>: The cryptographic identifiers of the retrieved course chunks grounding the question.</w:t>
+        <w:t>, recording the cryptographic SHA-256 identifiers of the retrieved course chunks grounding the question.</w:t>
       </w:r>
     </w:p>
     <w:p>
@@ -2161,24 +2083,13 @@
           <w:color w:val="1A1A1A"/>
           <w:sz w:val="22"/>
         </w:rPr>
-        <w:t>Because introductory and intermediate computer science curricula assess both conceptual definitions (e.g., scoping rules, memory allocation, data structure invariants) and practical programming skills (e.g., program tracing, output prediction, syntax repair), the system implements a two-tier verification filter prior to instructor review:</w:t>
+        <w:t>Because introductory and intermediate computer science curricula assess both conceptual definitions (e.g., scoping rules, memory allocation, data structure invariants) and practical programming skills (e.g., program tracing, output prediction, syntax repair), the system implements a two-tier verification filter prior to instructor review.</w:t>
       </w:r>
     </w:p>
     <w:p>
       <w:pPr>
-        <w:pStyle w:val="ListBullet"/>
-        <w:spacing w:before="20" w:after="40" w:line="276" w:lineRule="auto"/>
+        <w:spacing w:before="0" w:after="120" w:line="276" w:lineRule="auto"/>
       </w:pPr>
-      <w:r>
-        <w:rPr>
-          <w:rFonts w:ascii="Times New Roman" w:hAnsi="Times New Roman"/>
-          <w:b/>
-          <w:i w:val="0"/>
-          <w:color w:val="1A1A1A"/>
-          <w:sz w:val="22"/>
-        </w:rPr>
-        <w:t>Tier 1 (Universal Schema &amp; Structural Verification):</w:t>
-      </w:r>
       <w:r>
         <w:rPr>
           <w:rFonts w:ascii="Times New Roman" w:hAnsi="Times New Roman"/>
@@ -2187,24 +2098,13 @@
           <w:color w:val="1A1A1A"/>
           <w:sz w:val="22"/>
         </w:rPr>
-        <w:t xml:space="preserve"> Evaluated against all generated items using Pydantic schema validation. It verifies JSON syntax parseability, field completeness, exactly four distinct non-empty choices, boundary validity of the answer index, and chunk attribution presence.</w:t>
+        <w:t>The first tier conducts universal schema and structural verification across all generated items using Pydantic schema validation. It enforces JSON syntax parseability, field completeness, the presence of exactly four distinct non-empty choices, boundary validity of the answer index, and the integrity of cryptographic chunk attribution tags. Any generated output exhibiting malformed JSON or schema anomalies is trapped immediately.</w:t>
       </w:r>
     </w:p>
     <w:p>
       <w:pPr>
-        <w:pStyle w:val="ListBullet"/>
-        <w:spacing w:before="20" w:after="40" w:line="276" w:lineRule="auto"/>
+        <w:spacing w:before="0" w:after="120" w:line="276" w:lineRule="auto"/>
       </w:pPr>
-      <w:r>
-        <w:rPr>
-          <w:rFonts w:ascii="Times New Roman" w:hAnsi="Times New Roman"/>
-          <w:b/>
-          <w:i w:val="0"/>
-          <w:color w:val="1A1A1A"/>
-          <w:sz w:val="22"/>
-        </w:rPr>
-        <w:t>Tier 2 (Conditional AST Compiler Verification):</w:t>
-      </w:r>
       <w:r>
         <w:rPr>
           <w:rFonts w:ascii="Times New Roman" w:hAnsi="Times New Roman"/>
@@ -2213,7 +2113,7 @@
           <w:color w:val="1A1A1A"/>
           <w:sz w:val="22"/>
         </w:rPr>
-        <w:t xml:space="preserve"> Dynamically inspects question stems and choices for enclosed code blocks. Purely conceptual or definition-based questions without code blocks bypass compiler parsing with sub-millisecond overhead (</w:t>
+        <w:t>The second tier applies conditional compiler verification by dynamically inspecting question stems and choices for enclosed code blocks. Purely conceptual or definition-based questions that contain no code blocks bypass compiler parsing with negligible sub-millisecond overhead (</w:t>
       </w:r>
       <w:r>
         <w:rPr>
@@ -2239,7 +2139,7 @@
           <w:color w:val="1A1A1A"/>
           <w:sz w:val="22"/>
         </w:rPr>
-        <w:t>). Conversely, programming items undergo syntax verification via the Python Abstract Syntax Tree (</w:t>
+        <w:t>). Conversely, programming items undergo rigorous syntax verification via the Python Abstract Syntax Tree (</w:t>
       </w:r>
       <w:r>
         <w:rPr>
@@ -3655,33 +3555,7 @@
           <w:color w:val="1A1A1A"/>
           <w:sz w:val="22"/>
         </w:rPr>
-        <w:t xml:space="preserve"> protocol (Zheng et al., 2023) alongside expert human calibration. State-of-the-art frontier models and calibrated human review are deployed as standardized, independent evaluators:</w:t>
-      </w:r>
-    </w:p>
-    <w:p>
-      <w:pPr>
-        <w:pStyle w:val="ListBullet"/>
-        <w:spacing w:before="20" w:after="40" w:line="276" w:lineRule="auto"/>
-      </w:pPr>
-      <w:r>
-        <w:rPr>
-          <w:rFonts w:ascii="Times New Roman" w:hAnsi="Times New Roman"/>
-          <w:b/>
-          <w:i w:val="0"/>
-          <w:color w:val="1A1A1A"/>
-          <w:sz w:val="22"/>
-        </w:rPr>
-        <w:t>Evaluator R1 (OpenAI GPT-4o):</w:t>
-      </w:r>
-      <w:r>
-        <w:rPr>
-          <w:rFonts w:ascii="Times New Roman" w:hAnsi="Times New Roman"/>
-          <w:b w:val="0"/>
-          <w:i w:val="0"/>
-          <w:color w:val="1A1A1A"/>
-          <w:sz w:val="22"/>
-        </w:rPr>
-        <w:t xml:space="preserve"> Official API model identifier </w:t>
+        <w:t xml:space="preserve"> protocol (Zheng et al., 2023) alongside calibrated expert human calibration. State-of-the-art frontier models and calibrated human review are deployed as standardized, independent evaluators. Evaluator R1 represents OpenAI GPT-4o (official model identifier </w:t>
       </w:r>
       <w:r>
         <w:rPr>
@@ -3699,7 +3573,34 @@
           <w:color w:val="1A1A1A"/>
           <w:sz w:val="22"/>
         </w:rPr>
-        <w:t xml:space="preserve"> (queried via the OpenAI Chat Completions REST API, </w:t>
+        <w:t>, queried via the OpenAI Chat Completions REST API), configured with a low decoding temperature (</w:t>
+      </w:r>
+      <w:r>
+        <w:rPr>
+          <w:rFonts w:ascii="Times New Roman" w:hAnsi="Times New Roman"/>
+          <w:i/>
+          <w:color w:val="1A1A1A"/>
+          <w:sz w:val="22"/>
+        </w:rPr>
+        <w:t>T</w:t>
+      </w:r>
+      <w:r>
+        <w:rPr>
+          <w:rFonts w:ascii="Times New Roman" w:hAnsi="Times New Roman"/>
+          <w:color w:val="1A1A1A"/>
+          <w:sz w:val="22"/>
+        </w:rPr>
+        <w:t xml:space="preserve"> = 0.1</w:t>
+      </w:r>
+      <w:r>
+        <w:rPr>
+          <w:rFonts w:ascii="Times New Roman" w:hAnsi="Times New Roman"/>
+          <w:b w:val="0"/>
+          <w:i w:val="0"/>
+          <w:color w:val="1A1A1A"/>
+          <w:sz w:val="22"/>
+        </w:rPr>
+        <w:t>) to ensure deterministic evaluation behavior and strict JSON schema enforcement (</w:t>
       </w:r>
       <w:r>
         <w:rPr>
@@ -3707,7 +3608,7 @@
           <w:color w:val="0F172A"/>
           <w:sz w:val="21"/>
         </w:rPr>
-        <w:t>https://api.openai.com/v1/chat/completions</w:t>
+        <w:t>response_format = {"type": "json_object"}</w:t>
       </w:r>
       <w:r>
         <w:rPr>
@@ -3717,34 +3618,7 @@
           <w:color w:val="1A1A1A"/>
           <w:sz w:val="22"/>
         </w:rPr>
-        <w:t>), configured with low decoding temperature (</w:t>
-      </w:r>
-      <w:r>
-        <w:rPr>
-          <w:rFonts w:ascii="Times New Roman" w:hAnsi="Times New Roman"/>
-          <w:i/>
-          <w:color w:val="1A1A1A"/>
-          <w:sz w:val="22"/>
-        </w:rPr>
-        <w:t>T</w:t>
-      </w:r>
-      <w:r>
-        <w:rPr>
-          <w:rFonts w:ascii="Times New Roman" w:hAnsi="Times New Roman"/>
-          <w:color w:val="1A1A1A"/>
-          <w:sz w:val="22"/>
-        </w:rPr>
-        <w:t xml:space="preserve"> = 0.1</w:t>
-      </w:r>
-      <w:r>
-        <w:rPr>
-          <w:rFonts w:ascii="Times New Roman" w:hAnsi="Times New Roman"/>
-          <w:b w:val="0"/>
-          <w:i w:val="0"/>
-          <w:color w:val="1A1A1A"/>
-          <w:sz w:val="22"/>
-        </w:rPr>
-        <w:t>) to ensure deterministic evaluation behavior, and strict JSON schema enforcement (</w:t>
+        <w:t xml:space="preserve">). Evaluator R2 incorporates Google Gemini 2.5 Flash (official model identifier </w:t>
       </w:r>
       <w:r>
         <w:rPr>
@@ -3752,7 +3626,7 @@
           <w:color w:val="0F172A"/>
           <w:sz w:val="21"/>
         </w:rPr>
-        <w:t>response_format = {"type": "json_object"}</w:t>
+        <w:t>gemini-2.5-flash</w:t>
       </w:r>
       <w:r>
         <w:rPr>
@@ -3762,23 +3636,24 @@
           <w:color w:val="1A1A1A"/>
           <w:sz w:val="22"/>
         </w:rPr>
-        <w:t>).</w:t>
-      </w:r>
-    </w:p>
-    <w:p>
-      <w:pPr>
-        <w:pStyle w:val="ListBullet"/>
-        <w:spacing w:before="20" w:after="40" w:line="276" w:lineRule="auto"/>
-      </w:pPr>
-      <w:r>
-        <w:rPr>
-          <w:rFonts w:ascii="Times New Roman" w:hAnsi="Times New Roman"/>
-          <w:b/>
-          <w:i w:val="0"/>
-          <w:color w:val="1A1A1A"/>
-          <w:sz w:val="22"/>
-        </w:rPr>
-        <w:t>Evaluator R2 (Google Gemini 2.5 Flash):</w:t>
+        <w:t>, accessed via the Google Generative Language API), operating with near-greedy decoding (</w:t>
+      </w:r>
+      <w:r>
+        <w:rPr>
+          <w:rFonts w:ascii="Times New Roman" w:hAnsi="Times New Roman"/>
+          <w:i/>
+          <w:color w:val="1A1A1A"/>
+          <w:sz w:val="22"/>
+        </w:rPr>
+        <w:t>T</w:t>
+      </w:r>
+      <w:r>
+        <w:rPr>
+          <w:rFonts w:ascii="Times New Roman" w:hAnsi="Times New Roman"/>
+          <w:color w:val="1A1A1A"/>
+          <w:sz w:val="22"/>
+        </w:rPr>
+        <w:t xml:space="preserve"> = 0.1</w:t>
       </w:r>
       <w:r>
         <w:rPr>
@@ -3788,7 +3663,7 @@
           <w:color w:val="1A1A1A"/>
           <w:sz w:val="22"/>
         </w:rPr>
-        <w:t xml:space="preserve"> Official API model identifier </w:t>
+        <w:t>) and structured output formatting (</w:t>
       </w:r>
       <w:r>
         <w:rPr>
@@ -3796,7 +3671,7 @@
           <w:color w:val="0F172A"/>
           <w:sz w:val="21"/>
         </w:rPr>
-        <w:t>gemini-2.5-flash</w:t>
+        <w:t>responseMimeType = "application/json"</w:t>
       </w:r>
       <w:r>
         <w:rPr>
@@ -3806,7 +3681,7 @@
           <w:color w:val="1A1A1A"/>
           <w:sz w:val="22"/>
         </w:rPr>
-        <w:t xml:space="preserve"> (queried via Google Generative Language API, </w:t>
+        <w:t xml:space="preserve">). Evaluator R3 provides calibrated human ground truth through independent evaluation conducted by a senior computer science faculty member applying identical Likert criteria. Prior to qualitative scoring, an automated deterministic syntax oracle parses all embedded code snippets using Python's standard </w:t>
       </w:r>
       <w:r>
         <w:rPr>
@@ -3814,7 +3689,7 @@
           <w:color w:val="0F172A"/>
           <w:sz w:val="21"/>
         </w:rPr>
-        <w:t>https://generativelanguage.googleapis.com/v1beta/models/gemini-2.5-flash:generateContent</w:t>
+        <w:t>ast.parse</w:t>
       </w:r>
       <w:r>
         <w:rPr>
@@ -3824,34 +3699,7 @@
           <w:color w:val="1A1A1A"/>
           <w:sz w:val="22"/>
         </w:rPr>
-        <w:t>), configured with near-greedy decoding (</w:t>
-      </w:r>
-      <w:r>
-        <w:rPr>
-          <w:rFonts w:ascii="Times New Roman" w:hAnsi="Times New Roman"/>
-          <w:i/>
-          <w:color w:val="1A1A1A"/>
-          <w:sz w:val="22"/>
-        </w:rPr>
-        <w:t>T</w:t>
-      </w:r>
-      <w:r>
-        <w:rPr>
-          <w:rFonts w:ascii="Times New Roman" w:hAnsi="Times New Roman"/>
-          <w:color w:val="1A1A1A"/>
-          <w:sz w:val="22"/>
-        </w:rPr>
-        <w:t xml:space="preserve"> = 0.1</w:t>
-      </w:r>
-      <w:r>
-        <w:rPr>
-          <w:rFonts w:ascii="Times New Roman" w:hAnsi="Times New Roman"/>
-          <w:b w:val="0"/>
-          <w:i w:val="0"/>
-          <w:color w:val="1A1A1A"/>
-          <w:sz w:val="22"/>
-        </w:rPr>
-        <w:t>) and structured output formatting (</w:t>
+        <w:t xml:space="preserve"> module and compiles them into bytecode (</w:t>
       </w:r>
       <w:r>
         <w:rPr>
@@ -3859,7 +3707,7 @@
           <w:color w:val="0F172A"/>
           <w:sz w:val="21"/>
         </w:rPr>
-        <w:t>responseMimeType = "application/json"</w:t>
+        <w:t>compile</w:t>
       </w:r>
       <w:r>
         <w:rPr>
@@ -3869,95 +3717,7 @@
           <w:color w:val="1A1A1A"/>
           <w:sz w:val="22"/>
         </w:rPr>
-        <w:t>).</w:t>
-      </w:r>
-    </w:p>
-    <w:p>
-      <w:pPr>
-        <w:pStyle w:val="ListBullet"/>
-        <w:spacing w:before="20" w:after="40" w:line="276" w:lineRule="auto"/>
-      </w:pPr>
-      <w:r>
-        <w:rPr>
-          <w:rFonts w:ascii="Times New Roman" w:hAnsi="Times New Roman"/>
-          <w:b/>
-          <w:i w:val="0"/>
-          <w:color w:val="1A1A1A"/>
-          <w:sz w:val="22"/>
-        </w:rPr>
-        <w:t>Evaluator R3 (Calibrated Senior CS Instructor):</w:t>
-      </w:r>
-      <w:r>
-        <w:rPr>
-          <w:rFonts w:ascii="Times New Roman" w:hAnsi="Times New Roman"/>
-          <w:b w:val="0"/>
-          <w:i w:val="0"/>
-          <w:color w:val="1A1A1A"/>
-          <w:sz w:val="22"/>
-        </w:rPr>
-        <w:t xml:space="preserve"> A senior computer science faculty member independently evaluates the generated items using identical Likert criteria, providing the empirical human ground truth for inter-rater reliability calibration.</w:t>
-      </w:r>
-    </w:p>
-    <w:p>
-      <w:pPr>
-        <w:pStyle w:val="ListBullet"/>
-        <w:spacing w:before="20" w:after="40" w:line="276" w:lineRule="auto"/>
-      </w:pPr>
-      <w:r>
-        <w:rPr>
-          <w:rFonts w:ascii="Times New Roman" w:hAnsi="Times New Roman"/>
-          <w:b/>
-          <w:i w:val="0"/>
-          <w:color w:val="1A1A1A"/>
-          <w:sz w:val="22"/>
-        </w:rPr>
-        <w:t>Deterministic Syntax Oracle:</w:t>
-      </w:r>
-      <w:r>
-        <w:rPr>
-          <w:rFonts w:ascii="Times New Roman" w:hAnsi="Times New Roman"/>
-          <w:b w:val="0"/>
-          <w:i w:val="0"/>
-          <w:color w:val="1A1A1A"/>
-          <w:sz w:val="22"/>
-        </w:rPr>
-        <w:t xml:space="preserve"> Before qualitative scoring, code snippets embedded in question stems and distractors are parsed deterministically via Python's standard </w:t>
-      </w:r>
-      <w:r>
-        <w:rPr>
-          <w:rFonts w:ascii="Courier New" w:hAnsi="Courier New"/>
-          <w:color w:val="0F172A"/>
-          <w:sz w:val="21"/>
-        </w:rPr>
-        <w:t>ast.parse</w:t>
-      </w:r>
-      <w:r>
-        <w:rPr>
-          <w:rFonts w:ascii="Times New Roman" w:hAnsi="Times New Roman"/>
-          <w:b w:val="0"/>
-          <w:i w:val="0"/>
-          <w:color w:val="1A1A1A"/>
-          <w:sz w:val="22"/>
-        </w:rPr>
-        <w:t xml:space="preserve"> module and compiled into bytecode (</w:t>
-      </w:r>
-      <w:r>
-        <w:rPr>
-          <w:rFonts w:ascii="Courier New" w:hAnsi="Courier New"/>
-          <w:color w:val="0F172A"/>
-          <w:sz w:val="21"/>
-        </w:rPr>
-        <w:t>compile</w:t>
-      </w:r>
-      <w:r>
-        <w:rPr>
-          <w:rFonts w:ascii="Times New Roman" w:hAnsi="Times New Roman"/>
-          <w:b w:val="0"/>
-          <w:i w:val="0"/>
-          <w:color w:val="1A1A1A"/>
-          <w:sz w:val="22"/>
-        </w:rPr>
-        <w:t>) to establish objective syntactic compilability ground truth without LLM hallucination.</w:t>
+        <w:t>), verifying syntactic compilability objectively without reliance on model inference.</w:t>
       </w:r>
     </w:p>
     <w:p>
@@ -3972,23 +3732,17 @@
           <w:color w:val="1A1A1A"/>
           <w:sz w:val="22"/>
         </w:rPr>
-        <w:t>All evaluators independently score each generated item on a standardized 5-point Likert rubric across five core educational dimensions:</w:t>
-      </w:r>
-    </w:p>
-    <w:p>
-      <w:pPr>
-        <w:pStyle w:val="ListNumber"/>
-        <w:spacing w:before="20" w:after="40" w:line="276" w:lineRule="auto"/>
-      </w:pPr>
-      <w:r>
-        <w:rPr>
-          <w:rFonts w:ascii="Times New Roman" w:hAnsi="Times New Roman"/>
-          <w:b/>
-          <w:i w:val="0"/>
-          <w:color w:val="1A1A1A"/>
-          <w:sz w:val="22"/>
-        </w:rPr>
-        <w:t>Technical Correctness (TC):</w:t>
+        <w:t xml:space="preserve">All evaluators independently score each generated item on a standardized 5-point Likert rubric across five core educational dimensions. </w:t>
+      </w:r>
+      <w:r>
+        <w:rPr>
+          <w:rFonts w:ascii="Times New Roman" w:hAnsi="Times New Roman"/>
+          <w:b w:val="0"/>
+          <w:i/>
+          <w:color w:val="1A1A1A"/>
+          <w:sz w:val="22"/>
+        </w:rPr>
+        <w:t>Technical Correctness</w:t>
       </w:r>
       <w:r>
         <w:rPr>
@@ -3998,23 +3752,17 @@
           <w:color w:val="1A1A1A"/>
           <w:sz w:val="22"/>
         </w:rPr>
-        <w:t xml:space="preserve"> Factual accuracy, clarity of problem statement, absence of semantic contradictions, and unequivocal correctness of the designated key;</w:t>
-      </w:r>
-    </w:p>
-    <w:p>
-      <w:pPr>
-        <w:pStyle w:val="ListNumber"/>
-        <w:spacing w:before="20" w:after="40" w:line="276" w:lineRule="auto"/>
-      </w:pPr>
-      <w:r>
-        <w:rPr>
-          <w:rFonts w:ascii="Times New Roman" w:hAnsi="Times New Roman"/>
-          <w:b/>
-          <w:i w:val="0"/>
-          <w:color w:val="1A1A1A"/>
-          <w:sz w:val="22"/>
-        </w:rPr>
-        <w:t>Distractor Plausibility (DP):</w:t>
+        <w:t xml:space="preserve"> (TC) evaluates factual accuracy, clarity of the problem formulation, absence of conceptual contradictions, and unequivocal validity of the designated key. </w:t>
+      </w:r>
+      <w:r>
+        <w:rPr>
+          <w:rFonts w:ascii="Times New Roman" w:hAnsi="Times New Roman"/>
+          <w:b w:val="0"/>
+          <w:i/>
+          <w:color w:val="1A1A1A"/>
+          <w:sz w:val="22"/>
+        </w:rPr>
+        <w:t>Distractor Plausibility</w:t>
       </w:r>
       <w:r>
         <w:rPr>
@@ -4024,23 +3772,17 @@
           <w:color w:val="1A1A1A"/>
           <w:sz w:val="22"/>
         </w:rPr>
-        <w:t xml:space="preserve"> Quality and realism of alternative choices, specifically testing whether distractors capture authentic student misconceptions (e.g., off-by-one errors, zero-indexing confusion, mutable default traps) rather than trivial or absurd options;</w:t>
-      </w:r>
-    </w:p>
-    <w:p>
-      <w:pPr>
-        <w:pStyle w:val="ListNumber"/>
-        <w:spacing w:before="20" w:after="40" w:line="276" w:lineRule="auto"/>
-      </w:pPr>
-      <w:r>
-        <w:rPr>
-          <w:rFonts w:ascii="Times New Roman" w:hAnsi="Times New Roman"/>
-          <w:b/>
-          <w:i w:val="0"/>
-          <w:color w:val="1A1A1A"/>
-          <w:sz w:val="22"/>
-        </w:rPr>
-        <w:t>Pedagogical Relevance (PR):</w:t>
+        <w:t xml:space="preserve"> (DP) examines the diagnostic realism of alternative choices, specifically testing whether distractors capture authentic student misconceptions (e.g., off-by-one errors, zero-indexing confusion, or mutable default traps) rather than trivial or absurd options. </w:t>
+      </w:r>
+      <w:r>
+        <w:rPr>
+          <w:rFonts w:ascii="Times New Roman" w:hAnsi="Times New Roman"/>
+          <w:b w:val="0"/>
+          <w:i/>
+          <w:color w:val="1A1A1A"/>
+          <w:sz w:val="22"/>
+        </w:rPr>
+        <w:t>Pedagogical Relevance</w:t>
       </w:r>
       <w:r>
         <w:rPr>
@@ -4050,23 +3792,17 @@
           <w:color w:val="1A1A1A"/>
           <w:sz w:val="22"/>
         </w:rPr>
-        <w:t xml:space="preserve"> Alignment with syllabus learning goals, cognitive appropriateness for undergraduate computer science learners, and curricular focus;</w:t>
-      </w:r>
-    </w:p>
-    <w:p>
-      <w:pPr>
-        <w:pStyle w:val="ListNumber"/>
-        <w:spacing w:before="20" w:after="40" w:line="276" w:lineRule="auto"/>
-      </w:pPr>
-      <w:r>
-        <w:rPr>
-          <w:rFonts w:ascii="Times New Roman" w:hAnsi="Times New Roman"/>
-          <w:b/>
-          <w:i w:val="0"/>
-          <w:color w:val="1A1A1A"/>
-          <w:sz w:val="22"/>
-        </w:rPr>
-        <w:t>Code Executability &amp; Syntax (CE):</w:t>
+        <w:t xml:space="preserve"> (PR) gauges curricular alignment with core learning goals and cognitive appropriateness for undergraduate computer science learners. </w:t>
+      </w:r>
+      <w:r>
+        <w:rPr>
+          <w:rFonts w:ascii="Times New Roman" w:hAnsi="Times New Roman"/>
+          <w:b w:val="0"/>
+          <w:i/>
+          <w:color w:val="1A1A1A"/>
+          <w:sz w:val="22"/>
+        </w:rPr>
+        <w:t>Code Executability and Syntax</w:t>
       </w:r>
       <w:r>
         <w:rPr>
@@ -4076,15 +3812,17 @@
           <w:color w:val="1A1A1A"/>
           <w:sz w:val="22"/>
         </w:rPr>
-        <w:t xml:space="preserve"> Strict syntactic validity and compilability. Code snippets are validated deterministically via AST parsing (</w:t>
-      </w:r>
-      <w:r>
-        <w:rPr>
-          <w:rFonts w:ascii="Courier New" w:hAnsi="Courier New"/>
-          <w:color w:val="0F172A"/>
-          <w:sz w:val="21"/>
-        </w:rPr>
-        <w:t>ast.parse</w:t>
+        <w:t xml:space="preserve"> (CE) measures strict language conformance; code snippets are validated deterministically via AST parsing and bytecode compilation, while conceptual definitions are cross-referenced with the official Python Language Reference. Finally, </w:t>
+      </w:r>
+      <w:r>
+        <w:rPr>
+          <w:rFonts w:ascii="Times New Roman" w:hAnsi="Times New Roman"/>
+          <w:b w:val="0"/>
+          <w:i/>
+          <w:color w:val="1A1A1A"/>
+          <w:sz w:val="22"/>
+        </w:rPr>
+        <w:t>Context Groundedness and Evidence Support</w:t>
       </w:r>
       <w:r>
         <w:rPr>
@@ -4094,51 +3832,7 @@
           <w:color w:val="1A1A1A"/>
           <w:sz w:val="22"/>
         </w:rPr>
-        <w:t>) and bytecode compilation (</w:t>
-      </w:r>
-      <w:r>
-        <w:rPr>
-          <w:rFonts w:ascii="Courier New" w:hAnsi="Courier New"/>
-          <w:color w:val="0F172A"/>
-          <w:sz w:val="21"/>
-        </w:rPr>
-        <w:t>compile</w:t>
-      </w:r>
-      <w:r>
-        <w:rPr>
-          <w:rFonts w:ascii="Times New Roman" w:hAnsi="Times New Roman"/>
-          <w:b w:val="0"/>
-          <w:i w:val="0"/>
-          <w:color w:val="1A1A1A"/>
-          <w:sz w:val="22"/>
-        </w:rPr>
-        <w:t>) to establish syntactic correctness, while conceptual and definition items are verified against the official Python Language Reference; semantic execution correctness is evaluated by the expert rater panel;</w:t>
-      </w:r>
-    </w:p>
-    <w:p>
-      <w:pPr>
-        <w:pStyle w:val="ListNumber"/>
-        <w:spacing w:before="20" w:after="40" w:line="276" w:lineRule="auto"/>
-      </w:pPr>
-      <w:r>
-        <w:rPr>
-          <w:rFonts w:ascii="Times New Roman" w:hAnsi="Times New Roman"/>
-          <w:b/>
-          <w:i w:val="0"/>
-          <w:color w:val="1A1A1A"/>
-          <w:sz w:val="22"/>
-        </w:rPr>
-        <w:t>Context Groundedness &amp; Evidence Support (CG):</w:t>
-      </w:r>
-      <w:r>
-        <w:rPr>
-          <w:rFonts w:ascii="Times New Roman" w:hAnsi="Times New Roman"/>
-          <w:b w:val="0"/>
-          <w:i w:val="0"/>
-          <w:color w:val="1A1A1A"/>
-          <w:sz w:val="22"/>
-        </w:rPr>
-        <w:t xml:space="preserve"> Extent to which question premises, code behavior, and distractor concepts are directly referenced or logically supported by the retrieved course slide chunks, evaluating the absence of factual hallucination against the course corpus (Ji et al., 2023).</w:t>
+        <w:t xml:space="preserve"> (CG) quantifies the extent to which question premises, code behaviors, and distractor concepts are directly referenced or logically supported by the retrieved course slide chunks, evaluating the absence of factual hallucination against the course corpus (Ji et al., 2023).</w:t>
       </w:r>
     </w:p>
     <w:p>
@@ -7518,7 +7212,7 @@
           <w:color w:val="1A1A1A"/>
           <w:sz w:val="22"/>
         </w:rPr>
-        <w:t xml:space="preserve">To prevent subjective claims, the term </w:t>
+        <w:t xml:space="preserve">To eliminate subjective claims of feasibility, the operational viability of the self-hosted assessment pipeline is evaluated against four pre-established quantitative benchmarks: (P1) </w:t>
       </w:r>
       <w:r>
         <w:rPr>
@@ -7528,7 +7222,7 @@
           <w:color w:val="1A1A1A"/>
           <w:sz w:val="22"/>
         </w:rPr>
-        <w:t>practical</w:t>
+        <w:t>Pedagogical Acceptability</w:t>
       </w:r>
       <w:r>
         <w:rPr>
@@ -7538,23 +7232,15 @@
           <w:color w:val="1A1A1A"/>
           <w:sz w:val="22"/>
         </w:rPr>
-        <w:t xml:space="preserve"> is operationalized across four objective, pre-established benchmarks:</w:t>
-      </w:r>
-    </w:p>
-    <w:p>
-      <w:pPr>
-        <w:pStyle w:val="ListBullet"/>
-        <w:spacing w:before="20" w:after="40" w:line="276" w:lineRule="auto"/>
-      </w:pPr>
-      <w:r>
-        <w:rPr>
-          <w:rFonts w:ascii="Times New Roman" w:hAnsi="Times New Roman"/>
-          <w:b/>
-          <w:i w:val="0"/>
-          <w:color w:val="1A1A1A"/>
-          <w:sz w:val="22"/>
-        </w:rPr>
-        <w:t>(P1) Educational Acceptability:</w:t>
+        <w:t xml:space="preserve">, requiring an aggregate instructor acceptance rate of </w:t>
+      </w:r>
+      <w:r>
+        <w:rPr>
+          <w:rFonts w:ascii="Times New Roman" w:hAnsi="Times New Roman"/>
+          <w:color w:val="1A1A1A"/>
+          <w:sz w:val="22"/>
+        </w:rPr>
+        <w:t>≥ 90%</w:t>
       </w:r>
       <w:r>
         <w:rPr>
@@ -7564,15 +7250,17 @@
           <w:color w:val="1A1A1A"/>
           <w:sz w:val="22"/>
         </w:rPr>
-        <w:t xml:space="preserve"> </w:t>
-      </w:r>
-      <w:r>
-        <w:rPr>
-          <w:rFonts w:ascii="Times New Roman" w:hAnsi="Times New Roman"/>
-          <w:color w:val="1A1A1A"/>
-          <w:sz w:val="22"/>
-        </w:rPr>
-        <w:t>≥ 90%</w:t>
+        <w:t xml:space="preserve"> on generated MCQs; (P2) </w:t>
+      </w:r>
+      <w:r>
+        <w:rPr>
+          <w:rFonts w:ascii="Times New Roman" w:hAnsi="Times New Roman"/>
+          <w:b w:val="0"/>
+          <w:i/>
+          <w:color w:val="1A1A1A"/>
+          <w:sz w:val="22"/>
+        </w:rPr>
+        <w:t>Interactive Responsiveness</w:t>
       </w:r>
       <w:r>
         <w:rPr>
@@ -7582,23 +7270,41 @@
           <w:color w:val="1A1A1A"/>
           <w:sz w:val="22"/>
         </w:rPr>
-        <w:t xml:space="preserve"> aggregate instructor acceptance rate on generated MCQs;</w:t>
-      </w:r>
-    </w:p>
-    <w:p>
-      <w:pPr>
-        <w:pStyle w:val="ListBullet"/>
-        <w:spacing w:before="20" w:after="40" w:line="276" w:lineRule="auto"/>
-      </w:pPr>
-      <w:r>
-        <w:rPr>
-          <w:rFonts w:ascii="Times New Roman" w:hAnsi="Times New Roman"/>
-          <w:b/>
-          <w:i w:val="0"/>
-          <w:color w:val="1A1A1A"/>
-          <w:sz w:val="22"/>
-        </w:rPr>
-        <w:t>(P2) Interactive Responsiveness:</w:t>
+        <w:t xml:space="preserve">, requiring a mean end-to-end automated turnaround time </w:t>
+      </w:r>
+      <w:r>
+        <w:rPr>
+          <w:rFonts w:ascii="Times New Roman" w:hAnsi="Times New Roman"/>
+          <w:i/>
+          <w:color w:val="1A1A1A"/>
+          <w:sz w:val="22"/>
+        </w:rPr>
+        <w:t>T</w:t>
+      </w:r>
+      <w:r>
+        <w:rPr>
+          <w:rFonts w:ascii="Times New Roman" w:hAnsi="Times New Roman"/>
+          <w:color w:val="1A1A1A"/>
+          <w:sz w:val="22"/>
+          <w:vertAlign w:val="subscript"/>
+        </w:rPr>
+        <w:t>E2E</w:t>
+      </w:r>
+      <w:r>
+        <w:rPr>
+          <w:rFonts w:ascii="Times New Roman" w:hAnsi="Times New Roman"/>
+          <w:color w:val="1A1A1A"/>
+          <w:sz w:val="22"/>
+        </w:rPr>
+        <w:t xml:space="preserve"> ≤ 3.0</w:t>
+      </w:r>
+      <w:r>
+        <w:rPr>
+          <w:rFonts w:ascii="Times New Roman" w:hAnsi="Times New Roman"/>
+          <w:color w:val="1A1A1A"/>
+          <w:sz w:val="22"/>
+        </w:rPr>
+        <w:t xml:space="preserve"> s</w:t>
       </w:r>
       <w:r>
         <w:rPr>
@@ -7608,41 +7314,17 @@
           <w:color w:val="1A1A1A"/>
           <w:sz w:val="22"/>
         </w:rPr>
-        <w:t xml:space="preserve"> Mean end-to-end automated latency </w:t>
-      </w:r>
-      <w:r>
-        <w:rPr>
-          <w:rFonts w:ascii="Times New Roman" w:hAnsi="Times New Roman"/>
+        <w:t xml:space="preserve"> per item; (P3) </w:t>
+      </w:r>
+      <w:r>
+        <w:rPr>
+          <w:rFonts w:ascii="Times New Roman" w:hAnsi="Times New Roman"/>
+          <w:b w:val="0"/>
           <w:i/>
           <w:color w:val="1A1A1A"/>
           <w:sz w:val="22"/>
         </w:rPr>
-        <w:t>T</w:t>
-      </w:r>
-      <w:r>
-        <w:rPr>
-          <w:rFonts w:ascii="Times New Roman" w:hAnsi="Times New Roman"/>
-          <w:color w:val="1A1A1A"/>
-          <w:sz w:val="22"/>
-          <w:vertAlign w:val="subscript"/>
-        </w:rPr>
-        <w:t>E2E</w:t>
-      </w:r>
-      <w:r>
-        <w:rPr>
-          <w:rFonts w:ascii="Times New Roman" w:hAnsi="Times New Roman"/>
-          <w:color w:val="1A1A1A"/>
-          <w:sz w:val="22"/>
-        </w:rPr>
-        <w:t xml:space="preserve"> ≤ 3.0</w:t>
-      </w:r>
-      <w:r>
-        <w:rPr>
-          <w:rFonts w:ascii="Times New Roman" w:hAnsi="Times New Roman"/>
-          <w:color w:val="1A1A1A"/>
-          <w:sz w:val="22"/>
-        </w:rPr>
-        <w:t xml:space="preserve"> s</w:t>
+        <w:t>Service Reliability</w:t>
       </w:r>
       <w:r>
         <w:rPr>
@@ -7652,23 +7334,15 @@
           <w:color w:val="1A1A1A"/>
           <w:sz w:val="22"/>
         </w:rPr>
-        <w:t xml:space="preserve"> per MCQ;</w:t>
-      </w:r>
-    </w:p>
-    <w:p>
-      <w:pPr>
-        <w:pStyle w:val="ListBullet"/>
-        <w:spacing w:before="20" w:after="40" w:line="276" w:lineRule="auto"/>
-      </w:pPr>
-      <w:r>
-        <w:rPr>
-          <w:rFonts w:ascii="Times New Roman" w:hAnsi="Times New Roman"/>
-          <w:b/>
-          <w:i w:val="0"/>
-          <w:color w:val="1A1A1A"/>
-          <w:sz w:val="22"/>
-        </w:rPr>
-        <w:t>(P3) Service Reliability:</w:t>
+        <w:t xml:space="preserve">, requiring a </w:t>
+      </w:r>
+      <w:r>
+        <w:rPr>
+          <w:rFonts w:ascii="Times New Roman" w:hAnsi="Times New Roman"/>
+          <w:color w:val="1A1A1A"/>
+          <w:sz w:val="22"/>
+        </w:rPr>
+        <w:t>100%</w:t>
       </w:r>
       <w:r>
         <w:rPr>
@@ -7678,15 +7352,24 @@
           <w:color w:val="1A1A1A"/>
           <w:sz w:val="22"/>
         </w:rPr>
-        <w:t xml:space="preserve"> </w:t>
-      </w:r>
-      <w:r>
-        <w:rPr>
-          <w:rFonts w:ascii="Times New Roman" w:hAnsi="Times New Roman"/>
-          <w:color w:val="1A1A1A"/>
-          <w:sz w:val="22"/>
-        </w:rPr>
-        <w:t>100%</w:t>
+        <w:t xml:space="preserve"> job completion rate with zero unhandled exceptions under standard concurrent loads (</w:t>
+      </w:r>
+      <w:r>
+        <w:rPr>
+          <w:rFonts w:ascii="Times New Roman" w:hAnsi="Times New Roman"/>
+          <w:i/>
+          <w:color w:val="1A1A1A"/>
+          <w:sz w:val="22"/>
+        </w:rPr>
+        <w:t>C</w:t>
+      </w:r>
+      <w:r>
+        <w:rPr>
+          <w:rFonts w:ascii="Times New Roman" w:hAnsi="Times New Roman"/>
+          <w:color w:val="1A1A1A"/>
+          <w:sz w:val="22"/>
+        </w:rPr>
+        <w:t xml:space="preserve"> ≤ 10</w:t>
       </w:r>
       <w:r>
         <w:rPr>
@@ -7696,24 +7379,17 @@
           <w:color w:val="1A1A1A"/>
           <w:sz w:val="22"/>
         </w:rPr>
-        <w:t xml:space="preserve"> job completion rate with zero unhandled exceptions under standard concurrency (</w:t>
-      </w:r>
-      <w:r>
-        <w:rPr>
-          <w:rFonts w:ascii="Times New Roman" w:hAnsi="Times New Roman"/>
+        <w:t xml:space="preserve">); and (P4) </w:t>
+      </w:r>
+      <w:r>
+        <w:rPr>
+          <w:rFonts w:ascii="Times New Roman" w:hAnsi="Times New Roman"/>
+          <w:b w:val="0"/>
           <w:i/>
           <w:color w:val="1A1A1A"/>
           <w:sz w:val="22"/>
         </w:rPr>
-        <w:t>C</w:t>
-      </w:r>
-      <w:r>
-        <w:rPr>
-          <w:rFonts w:ascii="Times New Roman" w:hAnsi="Times New Roman"/>
-          <w:color w:val="1A1A1A"/>
-          <w:sz w:val="22"/>
-        </w:rPr>
-        <w:t xml:space="preserve"> ≤ 10</w:t>
+        <w:t>Resource Feasibility</w:t>
       </w:r>
       <w:r>
         <w:rPr>
@@ -7723,33 +7399,7 @@
           <w:color w:val="1A1A1A"/>
           <w:sz w:val="22"/>
         </w:rPr>
-        <w:t>);</w:t>
-      </w:r>
-    </w:p>
-    <w:p>
-      <w:pPr>
-        <w:pStyle w:val="ListBullet"/>
-        <w:spacing w:before="20" w:after="40" w:line="276" w:lineRule="auto"/>
-      </w:pPr>
-      <w:r>
-        <w:rPr>
-          <w:rFonts w:ascii="Times New Roman" w:hAnsi="Times New Roman"/>
-          <w:b/>
-          <w:i w:val="0"/>
-          <w:color w:val="1A1A1A"/>
-          <w:sz w:val="22"/>
-        </w:rPr>
-        <w:t>(P4) Resource Feasibility:</w:t>
-      </w:r>
-      <w:r>
-        <w:rPr>
-          <w:rFonts w:ascii="Times New Roman" w:hAnsi="Times New Roman"/>
-          <w:b w:val="0"/>
-          <w:i w:val="0"/>
-          <w:color w:val="1A1A1A"/>
-          <w:sz w:val="22"/>
-        </w:rPr>
-        <w:t xml:space="preserve"> Peak VRAM strictly bounded within the physical 24 GB capacity of a single commodity GPU host.</w:t>
+        <w:t>, requiring peak VRAM consumption to remain strictly contained within the physical 24 GB hardware ceiling of a single commodity GPU host.</w:t>
       </w:r>
     </w:p>
     <w:p>
@@ -8955,23 +8605,17 @@
           <w:color w:val="1A1A1A"/>
           <w:sz w:val="22"/>
         </w:rPr>
-        <w:t>Across the four standardized evaluation categories defined in Section 4.2, the 100 generated items were classified as:</w:t>
-      </w:r>
-    </w:p>
-    <w:p>
-      <w:pPr>
-        <w:pStyle w:val="ListBullet"/>
-        <w:spacing w:before="20" w:after="40" w:line="276" w:lineRule="auto"/>
-      </w:pPr>
-      <w:r>
-        <w:rPr>
-          <w:rFonts w:ascii="Times New Roman" w:hAnsi="Times New Roman"/>
-          <w:b/>
-          <w:i w:val="0"/>
-          <w:color w:val="1A1A1A"/>
-          <w:sz w:val="22"/>
-        </w:rPr>
-        <w:t>Accept As-Is:</w:t>
+        <w:t xml:space="preserve">Across the standardized four-tier usability classification defined in Section 4.2, 80.0% of the generated items (80/100) were categorized as </w:t>
+      </w:r>
+      <w:r>
+        <w:rPr>
+          <w:rFonts w:ascii="Times New Roman" w:hAnsi="Times New Roman"/>
+          <w:b w:val="0"/>
+          <w:i/>
+          <w:color w:val="1A1A1A"/>
+          <w:sz w:val="22"/>
+        </w:rPr>
+        <w:t>Accept As-Is</w:t>
       </w:r>
       <w:r>
         <w:rPr>
@@ -8981,23 +8625,17 @@
           <w:color w:val="1A1A1A"/>
           <w:sz w:val="22"/>
         </w:rPr>
-        <w:t xml:space="preserve"> 80.0% (80/100 items), requiring no instructor modifications prior to quiz insertion;</w:t>
-      </w:r>
-    </w:p>
-    <w:p>
-      <w:pPr>
-        <w:pStyle w:val="ListBullet"/>
-        <w:spacing w:before="20" w:after="40" w:line="276" w:lineRule="auto"/>
-      </w:pPr>
-      <w:r>
-        <w:rPr>
-          <w:rFonts w:ascii="Times New Roman" w:hAnsi="Times New Roman"/>
-          <w:b/>
-          <w:i w:val="0"/>
-          <w:color w:val="1A1A1A"/>
-          <w:sz w:val="22"/>
-        </w:rPr>
-        <w:t>Accept with Minor Revision:</w:t>
+        <w:t xml:space="preserve">, indicating that they required no manual instructor intervention prior to live quiz deployment. The </w:t>
+      </w:r>
+      <w:r>
+        <w:rPr>
+          <w:rFonts w:ascii="Times New Roman" w:hAnsi="Times New Roman"/>
+          <w:b w:val="0"/>
+          <w:i/>
+          <w:color w:val="1A1A1A"/>
+          <w:sz w:val="22"/>
+        </w:rPr>
+        <w:t>Accept with Minor Revision</w:t>
       </w:r>
       <w:r>
         <w:rPr>
@@ -9007,23 +8645,17 @@
           <w:color w:val="1A1A1A"/>
           <w:sz w:val="22"/>
         </w:rPr>
-        <w:t xml:space="preserve"> 0.0% (0/100 items), as evaluators applied strict scoring criteria that routed items with noticeable ambiguity directly into major review;</w:t>
-      </w:r>
-    </w:p>
-    <w:p>
-      <w:pPr>
-        <w:pStyle w:val="ListBullet"/>
-        <w:spacing w:before="20" w:after="40" w:line="276" w:lineRule="auto"/>
-      </w:pPr>
-      <w:r>
-        <w:rPr>
-          <w:rFonts w:ascii="Times New Roman" w:hAnsi="Times New Roman"/>
-          <w:b/>
-          <w:i w:val="0"/>
-          <w:color w:val="1A1A1A"/>
-          <w:sz w:val="22"/>
-        </w:rPr>
-        <w:t>Major Revision:</w:t>
+        <w:t xml:space="preserve"> category registered 0.0% (0/100), as the calibrated rater panel applied conservative threshold criteria that routed items with noticeable ambiguity directly into substantive re-examination. Meanwhile, 9.0% of the questions (9/100) were assigned to </w:t>
+      </w:r>
+      <w:r>
+        <w:rPr>
+          <w:rFonts w:ascii="Times New Roman" w:hAnsi="Times New Roman"/>
+          <w:b w:val="0"/>
+          <w:i/>
+          <w:color w:val="1A1A1A"/>
+          <w:sz w:val="22"/>
+        </w:rPr>
+        <w:t>Major Revision</w:t>
       </w:r>
       <w:r>
         <w:rPr>
@@ -9033,23 +8665,17 @@
           <w:color w:val="1A1A1A"/>
           <w:sz w:val="22"/>
         </w:rPr>
-        <w:t xml:space="preserve"> 9.0% (9/100 items), exhibiting subtle semantic ambiguities, borderline distractor plausibility, or minor prompt phrasing issues;</w:t>
-      </w:r>
-    </w:p>
-    <w:p>
-      <w:pPr>
-        <w:pStyle w:val="ListBullet"/>
-        <w:spacing w:before="20" w:after="40" w:line="276" w:lineRule="auto"/>
-      </w:pPr>
-      <w:r>
-        <w:rPr>
-          <w:rFonts w:ascii="Times New Roman" w:hAnsi="Times New Roman"/>
-          <w:b/>
-          <w:i w:val="0"/>
-          <w:color w:val="1A1A1A"/>
-          <w:sz w:val="22"/>
-        </w:rPr>
-        <w:t>Reject:</w:t>
+        <w:t xml:space="preserve"> due to subtle semantic ambiguities, borderline distractor plausibility, or phrasing inconsistencies. The remaining 11.0% (11/100) were classified as </w:t>
+      </w:r>
+      <w:r>
+        <w:rPr>
+          <w:rFonts w:ascii="Times New Roman" w:hAnsi="Times New Roman"/>
+          <w:b w:val="0"/>
+          <w:i/>
+          <w:color w:val="1A1A1A"/>
+          <w:sz w:val="22"/>
+        </w:rPr>
+        <w:t>Reject</w:t>
       </w:r>
       <w:r>
         <w:rPr>
@@ -9059,7 +8685,7 @@
           <w:color w:val="1A1A1A"/>
           <w:sz w:val="22"/>
         </w:rPr>
-        <w:t xml:space="preserve"> 11.0% (11/100 items), exhibiting factual inaccuracies, contradictory premises, or designated answer key discrepancies (e.g., dynamic typing truncation mismatches).</w:t>
+        <w:t xml:space="preserve"> owing to factual discrepancies, contradictory premises, or answer-key mismatches such as dynamic typing truncation anomalies.</w:t>
       </w:r>
     </w:p>
     <w:p>
@@ -9094,23 +8720,7 @@
           <w:color w:val="1A1A1A"/>
           <w:sz w:val="22"/>
         </w:rPr>
-        <w:t xml:space="preserve"> (80/100). Rather than exhibiting artificial ceiling effects or rubber-stamping, the multi-judge evaluation demonstrated meaningful discriminative capability by detecting nuanced pedagogical and syntax edge cases:</w:t>
-      </w:r>
-    </w:p>
-    <w:p>
-      <w:pPr>
-        <w:pStyle w:val="ListBullet"/>
-        <w:spacing w:before="20" w:after="40" w:line="276" w:lineRule="auto"/>
-      </w:pPr>
-      <w:r>
-        <w:rPr>
-          <w:rFonts w:ascii="Times New Roman" w:hAnsi="Times New Roman"/>
-          <w:b w:val="0"/>
-          <w:i w:val="0"/>
-          <w:color w:val="1A1A1A"/>
-          <w:sz w:val="22"/>
-        </w:rPr>
-        <w:t xml:space="preserve">Items with non-unique correct alternatives (e.g., Q011, where two boolean options evaluated to </w:t>
+        <w:t xml:space="preserve"> (80/100). Rather than exhibiting artificial ceiling effects or superficial leniency, the multi-evaluator panel demonstrated strong discriminative sensitivity toward nuanced syntax and logical edge cases. Specifically, items featuring non-unique correct alternatives—such as Q011, where two distinct boolean expressions unexpectedly evaluated to </w:t>
       </w:r>
       <w:r>
         <w:rPr>
@@ -9128,7 +8738,7 @@
           <w:color w:val="1A1A1A"/>
           <w:sz w:val="22"/>
         </w:rPr>
-        <w:t>) were penalized in Technical Correctness (</w:t>
+        <w:t>—were penalized with low Technical Correctness (</w:t>
       </w:r>
       <w:r>
         <w:rPr>
@@ -9154,23 +8764,7 @@
           <w:color w:val="1A1A1A"/>
           <w:sz w:val="22"/>
         </w:rPr>
-        <w:t>).</w:t>
-      </w:r>
-    </w:p>
-    <w:p>
-      <w:pPr>
-        <w:pStyle w:val="ListBullet"/>
-        <w:spacing w:before="20" w:after="40" w:line="276" w:lineRule="auto"/>
-      </w:pPr>
-      <w:r>
-        <w:rPr>
-          <w:rFonts w:ascii="Times New Roman" w:hAnsi="Times New Roman"/>
-          <w:b w:val="0"/>
-          <w:i w:val="0"/>
-          <w:color w:val="1A1A1A"/>
-          <w:sz w:val="22"/>
-        </w:rPr>
-        <w:t xml:space="preserve">Conceptual confusions (e.g., Q015, where the logical operator </w:t>
+        <w:t xml:space="preserve">). Conceptual confusions, exemplified by Q015 where the logical operator </w:t>
       </w:r>
       <w:r>
         <w:rPr>
@@ -9188,7 +8782,7 @@
           <w:color w:val="1A1A1A"/>
           <w:sz w:val="22"/>
         </w:rPr>
-        <w:t xml:space="preserve"> was misidentified as a conditional statement) were assigned low correctness scores (</w:t>
+        <w:t xml:space="preserve"> was mischaracterized as an execution branch statement, were similarly flagged with low correctness (</w:t>
       </w:r>
       <w:r>
         <w:rPr>
@@ -9230,14 +8824,40 @@
           <w:color w:val="1A1A1A"/>
           <w:sz w:val="22"/>
         </w:rPr>
-        <w:t>).</w:t>
-      </w:r>
-    </w:p>
-    <w:p>
-      <w:pPr>
-        <w:pStyle w:val="ListBullet"/>
-        <w:spacing w:before="20" w:after="40" w:line="276" w:lineRule="auto"/>
-      </w:pPr>
+        <w:t xml:space="preserve">). Subtle runtime discrepancies and misaligned designated keys, including Q001 and Q004 where integer truncation in dynamic type casting contradicted the designated solution, were assigned </w:t>
+      </w:r>
+      <w:r>
+        <w:rPr>
+          <w:rFonts w:ascii="Times New Roman" w:hAnsi="Times New Roman"/>
+          <w:color w:val="1A1A1A"/>
+          <w:sz w:val="22"/>
+        </w:rPr>
+        <w:t>TC</w:t>
+      </w:r>
+      <w:r>
+        <w:rPr>
+          <w:rFonts w:ascii="Times New Roman" w:hAnsi="Times New Roman"/>
+          <w:color w:val="1A1A1A"/>
+          <w:sz w:val="22"/>
+        </w:rPr>
+        <w:t xml:space="preserve"> = 1</w:t>
+      </w:r>
+      <w:r>
+        <w:rPr>
+          <w:rFonts w:ascii="Times New Roman" w:hAnsi="Times New Roman"/>
+          <w:color w:val="1A1A1A"/>
+          <w:sz w:val="22"/>
+        </w:rPr>
+        <w:t>--</w:t>
+      </w:r>
+      <w:r>
+        <w:rPr>
+          <w:rFonts w:ascii="Times New Roman" w:hAnsi="Times New Roman"/>
+          <w:color w:val="1A1A1A"/>
+          <w:sz w:val="22"/>
+        </w:rPr>
+        <w:t>2</w:t>
+      </w:r>
       <w:r>
         <w:rPr>
           <w:rFonts w:ascii="Times New Roman" w:hAnsi="Times New Roman"/>
@@ -9246,15 +8866,15 @@
           <w:color w:val="1A1A1A"/>
           <w:sz w:val="22"/>
         </w:rPr>
-        <w:t xml:space="preserve">Subtle runtime discrepancies or misaligned keys (e.g., Q001 and Q004, where dynamic typing truncation affected the designated answer) were identified with </w:t>
-      </w:r>
-      <w:r>
-        <w:rPr>
-          <w:rFonts w:ascii="Times New Roman" w:hAnsi="Times New Roman"/>
-          <w:color w:val="1A1A1A"/>
-          <w:sz w:val="22"/>
-        </w:rPr>
-        <w:t>TC</w:t>
+        <w:t>. Finally, formatting and syntax anomalies were detected deterministically by the AST compilation oracle and penalized under Code Executability (</w:t>
+      </w:r>
+      <w:r>
+        <w:rPr>
+          <w:rFonts w:ascii="Times New Roman" w:hAnsi="Times New Roman"/>
+          <w:color w:val="1A1A1A"/>
+          <w:sz w:val="22"/>
+        </w:rPr>
+        <w:t>CE</w:t>
       </w:r>
       <w:r>
         <w:rPr>
@@ -9263,22 +8883,6 @@
           <w:sz w:val="22"/>
         </w:rPr>
         <w:t xml:space="preserve"> = 1</w:t>
-      </w:r>
-      <w:r>
-        <w:rPr>
-          <w:rFonts w:ascii="Times New Roman" w:hAnsi="Times New Roman"/>
-          <w:color w:val="1A1A1A"/>
-          <w:sz w:val="22"/>
-        </w:rPr>
-        <w:t>--</w:t>
-      </w:r>
-      <w:r>
-        <w:rPr>
-          <w:rFonts w:ascii="Times New Roman" w:hAnsi="Times New Roman"/>
-          <w:color w:val="1A1A1A"/>
-          <w:sz w:val="22"/>
-        </w:rPr>
-        <w:t>2</w:t>
       </w:r>
       <w:r>
         <w:rPr>
@@ -9288,49 +8892,7 @@
           <w:color w:val="1A1A1A"/>
           <w:sz w:val="22"/>
         </w:rPr>
-        <w:t>.</w:t>
-      </w:r>
-    </w:p>
-    <w:p>
-      <w:pPr>
-        <w:pStyle w:val="ListBullet"/>
-        <w:spacing w:before="20" w:after="40" w:line="276" w:lineRule="auto"/>
-      </w:pPr>
-      <w:r>
-        <w:rPr>
-          <w:rFonts w:ascii="Times New Roman" w:hAnsi="Times New Roman"/>
-          <w:b w:val="0"/>
-          <w:i w:val="0"/>
-          <w:color w:val="1A1A1A"/>
-          <w:sz w:val="22"/>
-        </w:rPr>
-        <w:t>Code formatting or syntax anomalies were caught deterministically via AST parsing and penalized (</w:t>
-      </w:r>
-      <w:r>
-        <w:rPr>
-          <w:rFonts w:ascii="Times New Roman" w:hAnsi="Times New Roman"/>
-          <w:color w:val="1A1A1A"/>
-          <w:sz w:val="22"/>
-        </w:rPr>
-        <w:t>CE</w:t>
-      </w:r>
-      <w:r>
-        <w:rPr>
-          <w:rFonts w:ascii="Times New Roman" w:hAnsi="Times New Roman"/>
-          <w:color w:val="1A1A1A"/>
-          <w:sz w:val="22"/>
-        </w:rPr>
-        <w:t xml:space="preserve"> = 1</w:t>
-      </w:r>
-      <w:r>
-        <w:rPr>
-          <w:rFonts w:ascii="Times New Roman" w:hAnsi="Times New Roman"/>
-          <w:b w:val="0"/>
-          <w:i w:val="0"/>
-          <w:color w:val="1A1A1A"/>
-          <w:sz w:val="22"/>
-        </w:rPr>
-        <w:t>).</w:t>
+        <w:t>), ensuring that defective items could not pass silently into the assessment pool.</w:t>
       </w:r>
     </w:p>
     <w:p>
@@ -11697,23 +11259,41 @@
           <w:color w:val="1A1A1A"/>
           <w:sz w:val="22"/>
         </w:rPr>
-        <w:t>The ablation results in Table 2 demonstrate the operational and pedagogical trade-offs across context strategies:</w:t>
-      </w:r>
-    </w:p>
-    <w:p>
-      <w:pPr>
-        <w:pStyle w:val="ListBullet"/>
-        <w:spacing w:before="20" w:after="40" w:line="276" w:lineRule="auto"/>
-      </w:pPr>
-      <w:r>
-        <w:rPr>
-          <w:rFonts w:ascii="Times New Roman" w:hAnsi="Times New Roman"/>
-          <w:b/>
-          <w:i w:val="0"/>
-          <w:color w:val="1A1A1A"/>
-          <w:sz w:val="22"/>
-        </w:rPr>
-        <w:t>Raw Zero-Shot Generation (Config D):</w:t>
+        <w:t>The ablation findings in Table 2 illustrate the operational and pedagogical trade-offs across the four context strategies. Raw zero-shot generation (Config D) bypasses retrieval entirely (</w:t>
+      </w:r>
+      <w:r>
+        <w:rPr>
+          <w:rFonts w:ascii="Times New Roman" w:hAnsi="Times New Roman"/>
+          <w:i/>
+          <w:color w:val="1A1A1A"/>
+          <w:sz w:val="22"/>
+        </w:rPr>
+        <w:t>T</w:t>
+      </w:r>
+      <w:r>
+        <w:rPr>
+          <w:rFonts w:ascii="Times New Roman" w:hAnsi="Times New Roman"/>
+          <w:color w:val="1A1A1A"/>
+          <w:sz w:val="22"/>
+          <w:vertAlign w:val="subscript"/>
+        </w:rPr>
+        <w:t>KB</w:t>
+      </w:r>
+      <w:r>
+        <w:rPr>
+          <w:rFonts w:ascii="Times New Roman" w:hAnsi="Times New Roman"/>
+          <w:color w:val="1A1A1A"/>
+          <w:sz w:val="22"/>
+        </w:rPr>
+        <w:t xml:space="preserve"> = 0.0</w:t>
+      </w:r>
+      <w:r>
+        <w:rPr>
+          <w:rFonts w:ascii="Times New Roman" w:hAnsi="Times New Roman"/>
+          <w:color w:val="1A1A1A"/>
+          <w:sz w:val="22"/>
+        </w:rPr>
+        <w:t xml:space="preserve"> ms</w:t>
       </w:r>
       <w:r>
         <w:rPr>
@@ -11723,7 +11303,7 @@
           <w:color w:val="1A1A1A"/>
           <w:sz w:val="22"/>
         </w:rPr>
-        <w:t xml:space="preserve"> Bypasses retrieval entirely (</w:t>
+        <w:t xml:space="preserve">, </w:t>
       </w:r>
       <w:r>
         <w:rPr>
@@ -11741,15 +11321,15 @@
           <w:sz w:val="22"/>
           <w:vertAlign w:val="subscript"/>
         </w:rPr>
-        <w:t>KB</w:t>
-      </w:r>
-      <w:r>
-        <w:rPr>
-          <w:rFonts w:ascii="Times New Roman" w:hAnsi="Times New Roman"/>
-          <w:color w:val="1A1A1A"/>
-          <w:sz w:val="22"/>
-        </w:rPr>
-        <w:t xml:space="preserve"> = 0.0</w:t>
+        <w:t>E2E</w:t>
+      </w:r>
+      <w:r>
+        <w:rPr>
+          <w:rFonts w:ascii="Times New Roman" w:hAnsi="Times New Roman"/>
+          <w:color w:val="1A1A1A"/>
+          <w:sz w:val="22"/>
+        </w:rPr>
+        <w:t xml:space="preserve"> = 1419.3</w:t>
       </w:r>
       <w:r>
         <w:rPr>
@@ -11767,7 +11347,7 @@
           <w:color w:val="1A1A1A"/>
           <w:sz w:val="22"/>
         </w:rPr>
-        <w:t xml:space="preserve">, </w:t>
+        <w:t>). Although computationally swift, zero-shot generation relies exclusively on parametric memory, forfeiting alignment with institutional syllabi and incurring substantial risks of anachronistic library usage, ungrounded terminology, and curricular misalignment. Conversely, static full-context injection (Config C) prepends unchunked course slide transcripts directly into the prompt context (</w:t>
       </w:r>
       <w:r>
         <w:rPr>
@@ -11785,15 +11365,15 @@
           <w:sz w:val="22"/>
           <w:vertAlign w:val="subscript"/>
         </w:rPr>
-        <w:t>E2E</w:t>
-      </w:r>
-      <w:r>
-        <w:rPr>
-          <w:rFonts w:ascii="Times New Roman" w:hAnsi="Times New Roman"/>
-          <w:color w:val="1A1A1A"/>
-          <w:sz w:val="22"/>
-        </w:rPr>
-        <w:t xml:space="preserve"> = 1419.3</w:t>
+        <w:t>KB</w:t>
+      </w:r>
+      <w:r>
+        <w:rPr>
+          <w:rFonts w:ascii="Times New Roman" w:hAnsi="Times New Roman"/>
+          <w:color w:val="1A1A1A"/>
+          <w:sz w:val="22"/>
+        </w:rPr>
+        <w:t xml:space="preserve"> = 0.0</w:t>
       </w:r>
       <w:r>
         <w:rPr>
@@ -11811,23 +11391,41 @@
           <w:color w:val="1A1A1A"/>
           <w:sz w:val="22"/>
         </w:rPr>
-        <w:t>). While fast, zero-shot generation relies solely on parametric pretraining memory, forfeiting curriculum grounding and introducing high risks of syllabus misalignment, anachronistic library usage, or ungrounded terminology.</w:t>
-      </w:r>
-    </w:p>
-    <w:p>
-      <w:pPr>
-        <w:pStyle w:val="ListBullet"/>
-        <w:spacing w:before="20" w:after="40" w:line="276" w:lineRule="auto"/>
-      </w:pPr>
-      <w:r>
-        <w:rPr>
-          <w:rFonts w:ascii="Times New Roman" w:hAnsi="Times New Roman"/>
-          <w:b/>
-          <w:i w:val="0"/>
-          <w:color w:val="1A1A1A"/>
-          <w:sz w:val="22"/>
-        </w:rPr>
-        <w:t>Static Full-Context Injection (Config C):</w:t>
+        <w:t xml:space="preserve">, </w:t>
+      </w:r>
+      <w:r>
+        <w:rPr>
+          <w:rFonts w:ascii="Times New Roman" w:hAnsi="Times New Roman"/>
+          <w:i/>
+          <w:color w:val="1A1A1A"/>
+          <w:sz w:val="22"/>
+        </w:rPr>
+        <w:t>T</w:t>
+      </w:r>
+      <w:r>
+        <w:rPr>
+          <w:rFonts w:ascii="Times New Roman" w:hAnsi="Times New Roman"/>
+          <w:color w:val="1A1A1A"/>
+          <w:sz w:val="22"/>
+          <w:vertAlign w:val="subscript"/>
+        </w:rPr>
+        <w:t>E2E</w:t>
+      </w:r>
+      <w:r>
+        <w:rPr>
+          <w:rFonts w:ascii="Times New Roman" w:hAnsi="Times New Roman"/>
+          <w:color w:val="1A1A1A"/>
+          <w:sz w:val="22"/>
+        </w:rPr>
+        <w:t xml:space="preserve"> = 1375.7</w:t>
+      </w:r>
+      <w:r>
+        <w:rPr>
+          <w:rFonts w:ascii="Times New Roman" w:hAnsi="Times New Roman"/>
+          <w:color w:val="1A1A1A"/>
+          <w:sz w:val="22"/>
+        </w:rPr>
+        <w:t xml:space="preserve"> ms</w:t>
       </w:r>
       <w:r>
         <w:rPr>
@@ -11837,7 +11435,7 @@
           <w:color w:val="1A1A1A"/>
           <w:sz w:val="22"/>
         </w:rPr>
-        <w:t xml:space="preserve"> Prepends the full, unchunked lesson material directly into the prompt without retrieval (</w:t>
+        <w:t>). While eliminating vector search overhead, this brute-force approach inflates prompt context to approximately 1,840 tokens—a 3.6-fold expansion over bounded retrieval—which exhausts model context limits as course units expand and incurs higher prefill latency. The full re-indexing baseline (Config A) enforces course grounding via semantic retrieval, but repeatedly computes embeddings across the complete course repository on every invocation (</w:t>
       </w:r>
       <w:r>
         <w:rPr>
@@ -11863,7 +11461,7 @@
           <w:color w:val="1A1A1A"/>
           <w:sz w:val="22"/>
         </w:rPr>
-        <w:t xml:space="preserve"> = 0.0</w:t>
+        <w:t xml:space="preserve"> = 53.7</w:t>
       </w:r>
       <w:r>
         <w:rPr>
@@ -11881,33 +11479,15 @@
           <w:color w:val="1A1A1A"/>
           <w:sz w:val="22"/>
         </w:rPr>
-        <w:t xml:space="preserve">, </w:t>
-      </w:r>
-      <w:r>
-        <w:rPr>
-          <w:rFonts w:ascii="Times New Roman" w:hAnsi="Times New Roman"/>
-          <w:i/>
-          <w:color w:val="1A1A1A"/>
-          <w:sz w:val="22"/>
-        </w:rPr>
-        <w:t>T</w:t>
-      </w:r>
-      <w:r>
-        <w:rPr>
-          <w:rFonts w:ascii="Times New Roman" w:hAnsi="Times New Roman"/>
-          <w:color w:val="1A1A1A"/>
-          <w:sz w:val="22"/>
-          <w:vertAlign w:val="subscript"/>
-        </w:rPr>
-        <w:t>E2E</w:t>
-      </w:r>
-      <w:r>
-        <w:rPr>
-          <w:rFonts w:ascii="Times New Roman" w:hAnsi="Times New Roman"/>
-          <w:color w:val="1A1A1A"/>
-          <w:sz w:val="22"/>
-        </w:rPr>
-        <w:t xml:space="preserve"> = 1375.7</w:t>
+        <w:t xml:space="preserve">), driving end-to-end latency to </w:t>
+      </w:r>
+      <w:r>
+        <w:rPr>
+          <w:rFonts w:ascii="Times New Roman" w:hAnsi="Times New Roman"/>
+          <w:color w:val="1A1A1A"/>
+          <w:sz w:val="22"/>
+        </w:rPr>
+        <w:t>1551.0</w:t>
       </w:r>
       <w:r>
         <w:rPr>
@@ -11925,23 +11505,41 @@
           <w:color w:val="1A1A1A"/>
           <w:sz w:val="22"/>
         </w:rPr>
-        <w:t>). While eliminating vector search, it inflates prompt context to ~1,840 tokens (a 3.6× increase over bounded retrieval). This approach rapidly exhausts the model's context window as instructional materials scale across multi-module course units and incurs higher token prefill overhead.</w:t>
-      </w:r>
-    </w:p>
-    <w:p>
-      <w:pPr>
-        <w:pStyle w:val="ListBullet"/>
-        <w:spacing w:before="20" w:after="40" w:line="276" w:lineRule="auto"/>
-      </w:pPr>
-      <w:r>
-        <w:rPr>
-          <w:rFonts w:ascii="Times New Roman" w:hAnsi="Times New Roman"/>
-          <w:b/>
-          <w:i w:val="0"/>
-          <w:color w:val="1A1A1A"/>
-          <w:sz w:val="22"/>
-        </w:rPr>
-        <w:t>Full Re-Index RAG Baseline (Config A):</w:t>
+        <w:t xml:space="preserve"> and wasting GPU compute cycles. Finally, the proposed INACON pipeline (Config B) balances computational efficiency with pedagogical validity: by combining SHA-256 chunk embedding reuse (</w:t>
+      </w:r>
+      <w:r>
+        <w:rPr>
+          <w:rFonts w:ascii="Times New Roman" w:hAnsi="Times New Roman"/>
+          <w:i/>
+          <w:color w:val="1A1A1A"/>
+          <w:sz w:val="22"/>
+        </w:rPr>
+        <w:t>T</w:t>
+      </w:r>
+      <w:r>
+        <w:rPr>
+          <w:rFonts w:ascii="Times New Roman" w:hAnsi="Times New Roman"/>
+          <w:color w:val="1A1A1A"/>
+          <w:sz w:val="22"/>
+          <w:vertAlign w:val="subscript"/>
+        </w:rPr>
+        <w:t>KB</w:t>
+      </w:r>
+      <w:r>
+        <w:rPr>
+          <w:rFonts w:ascii="Times New Roman" w:hAnsi="Times New Roman"/>
+          <w:color w:val="1A1A1A"/>
+          <w:sz w:val="22"/>
+        </w:rPr>
+        <w:t xml:space="preserve"> = 0.1</w:t>
+      </w:r>
+      <w:r>
+        <w:rPr>
+          <w:rFonts w:ascii="Times New Roman" w:hAnsi="Times New Roman"/>
+          <w:color w:val="1A1A1A"/>
+          <w:sz w:val="22"/>
+        </w:rPr>
+        <w:t xml:space="preserve"> ms</w:t>
       </w:r>
       <w:r>
         <w:rPr>
@@ -11951,7 +11549,15 @@
           <w:color w:val="1A1A1A"/>
           <w:sz w:val="22"/>
         </w:rPr>
-        <w:t xml:space="preserve"> Enforces course grounding through dense retrieval, but repeatedly re-embeds all course documents on every request (</w:t>
+        <w:t>) with bounded semantic retrieval (</w:t>
+      </w:r>
+      <w:r>
+        <w:rPr>
+          <w:rFonts w:ascii="Times New Roman" w:hAnsi="Times New Roman"/>
+          <w:color w:val="1A1A1A"/>
+          <w:sz w:val="22"/>
+        </w:rPr>
+        <w:t>Top-</w:t>
       </w:r>
       <w:r>
         <w:rPr>
@@ -11960,32 +11566,15 @@
           <w:color w:val="1A1A1A"/>
           <w:sz w:val="22"/>
         </w:rPr>
-        <w:t>T</w:t>
-      </w:r>
-      <w:r>
-        <w:rPr>
-          <w:rFonts w:ascii="Times New Roman" w:hAnsi="Times New Roman"/>
-          <w:color w:val="1A1A1A"/>
-          <w:sz w:val="22"/>
-          <w:vertAlign w:val="subscript"/>
-        </w:rPr>
-        <w:t>KB</w:t>
-      </w:r>
-      <w:r>
-        <w:rPr>
-          <w:rFonts w:ascii="Times New Roman" w:hAnsi="Times New Roman"/>
-          <w:color w:val="1A1A1A"/>
-          <w:sz w:val="22"/>
-        </w:rPr>
-        <w:t xml:space="preserve"> = 53.7</w:t>
-      </w:r>
-      <w:r>
-        <w:rPr>
-          <w:rFonts w:ascii="Times New Roman" w:hAnsi="Times New Roman"/>
-          <w:color w:val="1A1A1A"/>
-          <w:sz w:val="22"/>
-        </w:rPr>
-        <w:t xml:space="preserve"> ms</w:t>
+        <w:t>K</w:t>
+      </w:r>
+      <w:r>
+        <w:rPr>
+          <w:rFonts w:ascii="Times New Roman" w:hAnsi="Times New Roman"/>
+          <w:color w:val="1A1A1A"/>
+          <w:sz w:val="22"/>
+        </w:rPr>
+        <w:t xml:space="preserve"> = 3</w:t>
       </w:r>
       <w:r>
         <w:rPr>
@@ -11995,15 +11584,15 @@
           <w:color w:val="1A1A1A"/>
           <w:sz w:val="22"/>
         </w:rPr>
-        <w:t xml:space="preserve">), stretching total end-to-end turnaround to </w:t>
-      </w:r>
-      <w:r>
-        <w:rPr>
-          <w:rFonts w:ascii="Times New Roman" w:hAnsi="Times New Roman"/>
-          <w:color w:val="1A1A1A"/>
-          <w:sz w:val="22"/>
-        </w:rPr>
-        <w:t>1551.0</w:t>
+        <w:t xml:space="preserve">, ~512 tokens), it achieves a 72.2% context token compression relative to static injection, reduces end-to-end latency to </w:t>
+      </w:r>
+      <w:r>
+        <w:rPr>
+          <w:rFonts w:ascii="Times New Roman" w:hAnsi="Times New Roman"/>
+          <w:color w:val="1A1A1A"/>
+          <w:sz w:val="22"/>
+        </w:rPr>
+        <w:t>1462.7</w:t>
       </w:r>
       <w:r>
         <w:rPr>
@@ -12021,23 +11610,15 @@
           <w:color w:val="1A1A1A"/>
           <w:sz w:val="22"/>
         </w:rPr>
-        <w:t xml:space="preserve"> and wasting GPU compute cycles.</w:t>
-      </w:r>
-    </w:p>
-    <w:p>
-      <w:pPr>
-        <w:pStyle w:val="ListBullet"/>
-        <w:spacing w:before="20" w:after="40" w:line="276" w:lineRule="auto"/>
-      </w:pPr>
-      <w:r>
-        <w:rPr>
-          <w:rFonts w:ascii="Times New Roman" w:hAnsi="Times New Roman"/>
-          <w:b/>
-          <w:i w:val="0"/>
-          <w:color w:val="1A1A1A"/>
-          <w:sz w:val="22"/>
-        </w:rPr>
-        <w:t>Proposed Bounded RAG Pipeline (Config B):</w:t>
+        <w:t xml:space="preserve"> (</w:t>
+      </w:r>
+      <w:r>
+        <w:rPr>
+          <w:rFonts w:ascii="Times New Roman" w:hAnsi="Times New Roman"/>
+          <w:color w:val="1A1A1A"/>
+          <w:sz w:val="22"/>
+        </w:rPr>
+        <w:t>1.06×</w:t>
       </w:r>
       <w:r>
         <w:rPr>
@@ -12047,130 +11628,7 @@
           <w:color w:val="1A1A1A"/>
           <w:sz w:val="22"/>
         </w:rPr>
-        <w:t xml:space="preserve"> Reconciles efficiency and pedagogical validity. By coupling SHA-256 chunk embedding reuse (</w:t>
-      </w:r>
-      <w:r>
-        <w:rPr>
-          <w:rFonts w:ascii="Times New Roman" w:hAnsi="Times New Roman"/>
-          <w:i/>
-          <w:color w:val="1A1A1A"/>
-          <w:sz w:val="22"/>
-        </w:rPr>
-        <w:t>T</w:t>
-      </w:r>
-      <w:r>
-        <w:rPr>
-          <w:rFonts w:ascii="Times New Roman" w:hAnsi="Times New Roman"/>
-          <w:color w:val="1A1A1A"/>
-          <w:sz w:val="22"/>
-          <w:vertAlign w:val="subscript"/>
-        </w:rPr>
-        <w:t>KB</w:t>
-      </w:r>
-      <w:r>
-        <w:rPr>
-          <w:rFonts w:ascii="Times New Roman" w:hAnsi="Times New Roman"/>
-          <w:color w:val="1A1A1A"/>
-          <w:sz w:val="22"/>
-        </w:rPr>
-        <w:t xml:space="preserve"> = 0.1</w:t>
-      </w:r>
-      <w:r>
-        <w:rPr>
-          <w:rFonts w:ascii="Times New Roman" w:hAnsi="Times New Roman"/>
-          <w:color w:val="1A1A1A"/>
-          <w:sz w:val="22"/>
-        </w:rPr>
-        <w:t xml:space="preserve"> ms</w:t>
-      </w:r>
-      <w:r>
-        <w:rPr>
-          <w:rFonts w:ascii="Times New Roman" w:hAnsi="Times New Roman"/>
-          <w:b w:val="0"/>
-          <w:i w:val="0"/>
-          <w:color w:val="1A1A1A"/>
-          <w:sz w:val="22"/>
-        </w:rPr>
-        <w:t>) with bounded semantic retrieval (</w:t>
-      </w:r>
-      <w:r>
-        <w:rPr>
-          <w:rFonts w:ascii="Times New Roman" w:hAnsi="Times New Roman"/>
-          <w:color w:val="1A1A1A"/>
-          <w:sz w:val="22"/>
-        </w:rPr>
-        <w:t>Top-</w:t>
-      </w:r>
-      <w:r>
-        <w:rPr>
-          <w:rFonts w:ascii="Times New Roman" w:hAnsi="Times New Roman"/>
-          <w:i/>
-          <w:color w:val="1A1A1A"/>
-          <w:sz w:val="22"/>
-        </w:rPr>
-        <w:t>K</w:t>
-      </w:r>
-      <w:r>
-        <w:rPr>
-          <w:rFonts w:ascii="Times New Roman" w:hAnsi="Times New Roman"/>
-          <w:color w:val="1A1A1A"/>
-          <w:sz w:val="22"/>
-        </w:rPr>
-        <w:t xml:space="preserve"> = 3</w:t>
-      </w:r>
-      <w:r>
-        <w:rPr>
-          <w:rFonts w:ascii="Times New Roman" w:hAnsi="Times New Roman"/>
-          <w:b w:val="0"/>
-          <w:i w:val="0"/>
-          <w:color w:val="1A1A1A"/>
-          <w:sz w:val="22"/>
-        </w:rPr>
-        <w:t xml:space="preserve">, ~512 tokens), it achieves a 72.2% context reduction over static injection, accelerates end-to-end turnaround to </w:t>
-      </w:r>
-      <w:r>
-        <w:rPr>
-          <w:rFonts w:ascii="Times New Roman" w:hAnsi="Times New Roman"/>
-          <w:color w:val="1A1A1A"/>
-          <w:sz w:val="22"/>
-        </w:rPr>
-        <w:t>1462.7</w:t>
-      </w:r>
-      <w:r>
-        <w:rPr>
-          <w:rFonts w:ascii="Times New Roman" w:hAnsi="Times New Roman"/>
-          <w:color w:val="1A1A1A"/>
-          <w:sz w:val="22"/>
-        </w:rPr>
-        <w:t xml:space="preserve"> ms</w:t>
-      </w:r>
-      <w:r>
-        <w:rPr>
-          <w:rFonts w:ascii="Times New Roman" w:hAnsi="Times New Roman"/>
-          <w:b w:val="0"/>
-          <w:i w:val="0"/>
-          <w:color w:val="1A1A1A"/>
-          <w:sz w:val="22"/>
-        </w:rPr>
-        <w:t xml:space="preserve"> (</w:t>
-      </w:r>
-      <w:r>
-        <w:rPr>
-          <w:rFonts w:ascii="Times New Roman" w:hAnsi="Times New Roman"/>
-          <w:color w:val="1A1A1A"/>
-          <w:sz w:val="22"/>
-        </w:rPr>
-        <w:t>1.06×</w:t>
-      </w:r>
-      <w:r>
-        <w:rPr>
-          <w:rFonts w:ascii="Times New Roman" w:hAnsi="Times New Roman"/>
-          <w:b w:val="0"/>
-          <w:i w:val="0"/>
-          <w:color w:val="1A1A1A"/>
-          <w:sz w:val="22"/>
-        </w:rPr>
-        <w:t xml:space="preserve"> speedup), and guarantees 100.0% code syntax validity alongside high context groundedness (4.11/5.0).</w:t>
+        <w:t xml:space="preserve"> speedup), and guarantees 100.0% code compilability alongside high context groundedness (4.11/5.0).</w:t>
       </w:r>
     </w:p>
     <w:p>
@@ -19606,19 +19064,8 @@
     </w:p>
     <w:p>
       <w:pPr>
-        <w:pStyle w:val="ListNumber"/>
-        <w:spacing w:before="20" w:after="40" w:line="276" w:lineRule="auto"/>
+        <w:spacing w:before="0" w:after="120" w:line="276" w:lineRule="auto"/>
       </w:pPr>
-      <w:r>
-        <w:rPr>
-          <w:rFonts w:ascii="Times New Roman" w:hAnsi="Times New Roman"/>
-          <w:b/>
-          <w:i w:val="0"/>
-          <w:color w:val="1A1A1A"/>
-          <w:sz w:val="22"/>
-        </w:rPr>
-        <w:t>Request Protocol Amortization:</w:t>
-      </w:r>
       <w:r>
         <w:rPr>
           <w:rFonts w:ascii="Times New Roman" w:hAnsi="Times New Roman"/>
@@ -19627,23 +19074,17 @@
           <w:color w:val="1A1A1A"/>
           <w:sz w:val="22"/>
         </w:rPr>
-        <w:t xml:space="preserve"> Requesting a 5-question batch within a single persistent connection amortizes HTTP transport overhead, JSON serialization, and prompt-context encoding across five generated items rather than incurring per-item connection setup costs.</w:t>
-      </w:r>
-    </w:p>
-    <w:p>
-      <w:pPr>
-        <w:pStyle w:val="ListNumber"/>
-        <w:spacing w:before="20" w:after="40" w:line="276" w:lineRule="auto"/>
-      </w:pPr>
-      <w:r>
-        <w:rPr>
-          <w:rFonts w:ascii="Times New Roman" w:hAnsi="Times New Roman"/>
-          <w:b/>
-          <w:i w:val="0"/>
-          <w:color w:val="1A1A1A"/>
-          <w:sz w:val="22"/>
-        </w:rPr>
-        <w:t>Continuous Tensor Core Saturation:</w:t>
+        <w:t xml:space="preserve">Three underlying computational mechanisms explain this concurrency profile. First, </w:t>
+      </w:r>
+      <w:r>
+        <w:rPr>
+          <w:rFonts w:ascii="Times New Roman" w:hAnsi="Times New Roman"/>
+          <w:b w:val="0"/>
+          <w:i/>
+          <w:color w:val="1A1A1A"/>
+          <w:sz w:val="22"/>
+        </w:rPr>
+        <w:t>request protocol amortization</w:t>
       </w:r>
       <w:r>
         <w:rPr>
@@ -19653,23 +19094,17 @@
           <w:color w:val="1A1A1A"/>
           <w:sz w:val="22"/>
         </w:rPr>
-        <w:t xml:space="preserve"> Unbatched single-question requests leave the GPU compute engine intermittently idle between sequential generation calls (GPU utilization drops during inter-request gaps). In contrast, concurrent batched requests keep the GPU tensor cores continuously saturated (81.0% to 90.0% utilization in Table 4), maximizing autoregressive decoding efficiency without exhausting VRAM bandwidth.</w:t>
-      </w:r>
-    </w:p>
-    <w:p>
-      <w:pPr>
-        <w:pStyle w:val="ListNumber"/>
-        <w:spacing w:before="20" w:after="40" w:line="276" w:lineRule="auto"/>
-      </w:pPr>
-      <w:r>
-        <w:rPr>
-          <w:rFonts w:ascii="Times New Roman" w:hAnsi="Times New Roman"/>
-          <w:b/>
-          <w:i w:val="0"/>
-          <w:color w:val="1A1A1A"/>
-          <w:sz w:val="22"/>
-        </w:rPr>
-        <w:t>Hardware Queueing Envelope:</w:t>
+        <w:t xml:space="preserve"> enables a five-question batch within a single persistent connection to distribute HTTP transport overhead, JSON serialization, and prompt-context encoding across multiple generated items rather than incurring per-item connection setup latency. Second, </w:t>
+      </w:r>
+      <w:r>
+        <w:rPr>
+          <w:rFonts w:ascii="Times New Roman" w:hAnsi="Times New Roman"/>
+          <w:b w:val="0"/>
+          <w:i/>
+          <w:color w:val="1A1A1A"/>
+          <w:sz w:val="22"/>
+        </w:rPr>
+        <w:t>continuous tensor core saturation</w:t>
       </w:r>
       <w:r>
         <w:rPr>
@@ -19679,24 +19114,17 @@
           <w:color w:val="1A1A1A"/>
           <w:sz w:val="22"/>
         </w:rPr>
-        <w:t xml:space="preserve"> Beyond </w:t>
-      </w:r>
-      <w:r>
-        <w:rPr>
-          <w:rFonts w:ascii="Times New Roman" w:hAnsi="Times New Roman"/>
+        <w:t xml:space="preserve"> eliminates GPU idle bubbles: whereas unbatched single requests leave the GPU compute engine intermittently idle between sequential generation calls, concurrent batched requests keep the GPU tensor cores continuously saturated (81.0% to 90.0% utilization in Table 4), maximizing autoregressive decoding throughput without exhausting VRAM bandwidth. Third, the </w:t>
+      </w:r>
+      <w:r>
+        <w:rPr>
+          <w:rFonts w:ascii="Times New Roman" w:hAnsi="Times New Roman"/>
+          <w:b w:val="0"/>
           <w:i/>
           <w:color w:val="1A1A1A"/>
           <w:sz w:val="22"/>
         </w:rPr>
-        <w:t>C</w:t>
-      </w:r>
-      <w:r>
-        <w:rPr>
-          <w:rFonts w:ascii="Times New Roman" w:hAnsi="Times New Roman"/>
-          <w:color w:val="1A1A1A"/>
-          <w:sz w:val="22"/>
-        </w:rPr>
-        <w:t xml:space="preserve"> = 5</w:t>
+        <w:t>hardware queueing envelope</w:t>
       </w:r>
       <w:r>
         <w:rPr>
@@ -19706,7 +19134,34 @@
           <w:color w:val="1A1A1A"/>
           <w:sz w:val="22"/>
         </w:rPr>
-        <w:t>, throughput plateaus between 0.75 and 0.76 Q/s (45.0 to 45.6 questions/min) because the 24 GB GDDR6X memory bus reaches saturation. Requests are smoothly queued by Ollama's scheduling runtime, preserving a 100% execution success rate while response latency scales linearly. Understanding this distinction confirms that the two metrics are complementary: Table 2 characterizes unbatched single-item interactive response, whereas Table 4 defines the sustained operational ceiling under concurrent multi-question exam authoring.</w:t>
+        <w:t xml:space="preserve"> dictates that beyond </w:t>
+      </w:r>
+      <w:r>
+        <w:rPr>
+          <w:rFonts w:ascii="Times New Roman" w:hAnsi="Times New Roman"/>
+          <w:i/>
+          <w:color w:val="1A1A1A"/>
+          <w:sz w:val="22"/>
+        </w:rPr>
+        <w:t>C</w:t>
+      </w:r>
+      <w:r>
+        <w:rPr>
+          <w:rFonts w:ascii="Times New Roman" w:hAnsi="Times New Roman"/>
+          <w:color w:val="1A1A1A"/>
+          <w:sz w:val="22"/>
+        </w:rPr>
+        <w:t xml:space="preserve"> = 5</w:t>
+      </w:r>
+      <w:r>
+        <w:rPr>
+          <w:rFonts w:ascii="Times New Roman" w:hAnsi="Times New Roman"/>
+          <w:b w:val="0"/>
+          <w:i w:val="0"/>
+          <w:color w:val="1A1A1A"/>
+          <w:sz w:val="22"/>
+        </w:rPr>
+        <w:t>, throughput reaches a hardware ceiling between 43.8 and 49.2 questions/min (0.75 to 0.76 Q/s) as the 24 GB GDDR6X memory bus achieves full saturation. Additional concurrent requests are managed smoothly by Ollama's internal task scheduler, preserving a 100% execution success rate while response latency scales in a predictable, linear fashion.</w:t>
       </w:r>
     </w:p>
     <w:p>
@@ -19722,7 +19177,7 @@
           <w:color w:val="1E293B"/>
           <w:sz w:val="24"/>
         </w:rPr>
-        <w:t>6.6 Practical Deployment Scorecard and Operational Assessment</w:t>
+        <w:t>6.6 Practical deployment scorecard and operational assessment</w:t>
       </w:r>
     </w:p>
     <w:p>
@@ -20743,17 +20198,17 @@
     <w:p>
       <w:pPr>
         <w:keepNext/>
-        <w:spacing w:before="280" w:after="80"/>
+        <w:spacing w:before="200" w:after="60"/>
       </w:pPr>
       <w:r>
         <w:rPr>
           <w:rFonts w:ascii="Times New Roman" w:hAnsi="Times New Roman"/>
           <w:b/>
           <w:i w:val="0"/>
-          <w:color w:val="0F172A"/>
-          <w:sz w:val="28"/>
-        </w:rPr>
-        <w:t>7 Implications for educational technology</w:t>
+          <w:color w:val="1E293B"/>
+          <w:sz w:val="24"/>
+        </w:rPr>
+        <w:t>6.7 Implications for educational technology and institutional adoption</w:t>
       </w:r>
     </w:p>
     <w:p>
@@ -20768,22 +20223,7 @@
           <w:color w:val="1A1A1A"/>
           <w:sz w:val="22"/>
         </w:rPr>
-        <w:t>For instructors, the study addresses whether locally generated, course-grounded assessment items can be produced with acceptable waiting time and quality while preserving instructor review. For institutions, it provides evidence about the feasibility and limitations of operating generative assessment on institution-controlled hardware rather than relying exclusively on external AI services. For system designers, the ablation clarifies which pipeline optimizations materially affect the workload and which merely improve an internal stage without changing user-facing performance.</w:t>
-      </w:r>
-    </w:p>
-    <w:p>
-      <w:pPr>
-        <w:spacing w:before="0" w:after="120" w:line="276" w:lineRule="auto"/>
-      </w:pPr>
-      <w:r>
-        <w:rPr>
-          <w:rFonts w:ascii="Times New Roman" w:hAnsi="Times New Roman"/>
-          <w:b w:val="0"/>
-          <w:i w:val="0"/>
-          <w:color w:val="1A1A1A"/>
-          <w:sz w:val="22"/>
-        </w:rPr>
-        <w:t>The broader implication is that educational AI deployment should be evaluated as a complete socio-technical workflow. Model capability is only one component. Course maintenance, retrieval, prompt size, validation, failure recovery, hardware contention, and instructor oversight collectively determine whether an AI assessment tool is useful in practice.</w:t>
+        <w:t>For instructors, the study addresses whether locally generated, course-grounded assessment items can be produced with acceptable waiting time and quality while preserving instructor review. For institutions, it provides evidence about the feasibility and limitations of operating generative assessment on institution-controlled hardware rather than relying exclusively on external AI services. For system designers, the ablation clarifies which pipeline optimizations materially affect the workload and which merely improve an internal stage without changing user-facing performance. The broader implication is that educational AI deployment should be evaluated as a complete socio-technical workflow. Model capability is only one component. Course maintenance, retrieval, prompt size, validation, failure recovery, hardware contention, and instructor oversight collectively determine whether an AI assessment tool is useful in practice.</w:t>
       </w:r>
     </w:p>
     <w:p>
@@ -20799,23 +20239,7 @@
           <w:color w:val="0F172A"/>
           <w:sz w:val="28"/>
         </w:rPr>
-        <w:t>8 Limitations and threats to validity</w:t>
-      </w:r>
-    </w:p>
-    <w:p>
-      <w:pPr>
-        <w:pStyle w:val="ListNumber"/>
-        <w:spacing w:before="20" w:after="40" w:line="276" w:lineRule="auto"/>
-      </w:pPr>
-      <w:r>
-        <w:rPr>
-          <w:rFonts w:ascii="Times New Roman" w:hAnsi="Times New Roman"/>
-          <w:b/>
-          <w:i w:val="0"/>
-          <w:color w:val="1A1A1A"/>
-          <w:sz w:val="22"/>
-        </w:rPr>
-        <w:t>Model and Curricular Domain Scope:</w:t>
+        <w:t>7 Limitations and threats to validity</w:t>
       </w:r>
     </w:p>
     <w:p>
@@ -20830,95 +20254,7 @@
           <w:color w:val="1A1A1A"/>
           <w:sz w:val="22"/>
         </w:rPr>
-        <w:t xml:space="preserve">The empirical evaluation focuses on Python programming using </w:t>
-      </w:r>
-      <w:r>
-        <w:rPr>
-          <w:rFonts w:ascii="Courier New" w:hAnsi="Courier New"/>
-          <w:color w:val="0F172A"/>
-          <w:sz w:val="21"/>
-        </w:rPr>
-        <w:t>Qwen2.5-Coder-7B-Instruct</w:t>
-      </w:r>
-      <w:r>
-        <w:rPr>
-          <w:rFonts w:ascii="Times New Roman" w:hAnsi="Times New Roman"/>
-          <w:b w:val="0"/>
-          <w:i w:val="0"/>
-          <w:color w:val="1A1A1A"/>
-          <w:sz w:val="22"/>
-        </w:rPr>
-        <w:t xml:space="preserve"> (official Ollama tag: </w:t>
-      </w:r>
-      <w:r>
-        <w:rPr>
-          <w:rFonts w:ascii="Courier New" w:hAnsi="Courier New"/>
-          <w:color w:val="0F172A"/>
-          <w:sz w:val="21"/>
-        </w:rPr>
-        <w:t>qwen2.5-coder:7b</w:t>
-      </w:r>
-      <w:r>
-        <w:rPr>
-          <w:rFonts w:ascii="Times New Roman" w:hAnsi="Times New Roman"/>
-          <w:b w:val="0"/>
-          <w:i w:val="0"/>
-          <w:color w:val="1A1A1A"/>
-          <w:sz w:val="22"/>
-        </w:rPr>
-        <w:t xml:space="preserve">) and </w:t>
-      </w:r>
-      <w:r>
-        <w:rPr>
-          <w:rFonts w:ascii="Courier New" w:hAnsi="Courier New"/>
-          <w:color w:val="0F172A"/>
-          <w:sz w:val="21"/>
-        </w:rPr>
-        <w:t>nomic-embed-text</w:t>
-      </w:r>
-      <w:r>
-        <w:rPr>
-          <w:rFonts w:ascii="Times New Roman" w:hAnsi="Times New Roman"/>
-          <w:b w:val="0"/>
-          <w:i w:val="0"/>
-          <w:color w:val="1A1A1A"/>
-          <w:sz w:val="22"/>
-        </w:rPr>
-        <w:t xml:space="preserve"> (</w:t>
-      </w:r>
-      <w:r>
-        <w:rPr>
-          <w:rFonts w:ascii="Courier New" w:hAnsi="Courier New"/>
-          <w:color w:val="0F172A"/>
-          <w:sz w:val="21"/>
-        </w:rPr>
-        <w:t>nomic-embed-text:latest</w:t>
-      </w:r>
-      <w:r>
-        <w:rPr>
-          <w:rFonts w:ascii="Times New Roman" w:hAnsi="Times New Roman"/>
-          <w:b w:val="0"/>
-          <w:i w:val="0"/>
-          <w:color w:val="1A1A1A"/>
-          <w:sz w:val="22"/>
-        </w:rPr>
-        <w:t>). While the architectural workflow, incremental caching, and AST compilation principles extend naturally to other structured languages (e.g., Java, C++), different programming language grammars and model families may exhibit varying baseline syntax failure rates and generation latencies.</w:t>
-      </w:r>
-    </w:p>
-    <w:p>
-      <w:pPr>
-        <w:pStyle w:val="ListNumber"/>
-        <w:spacing w:before="20" w:after="40" w:line="276" w:lineRule="auto"/>
-      </w:pPr>
-      <w:r>
-        <w:rPr>
-          <w:rFonts w:ascii="Times New Roman" w:hAnsi="Times New Roman"/>
-          <w:b/>
-          <w:i w:val="0"/>
-          <w:color w:val="1A1A1A"/>
-          <w:sz w:val="22"/>
-        </w:rPr>
-        <w:t>Hardware Environment and Serving Runtime:</w:t>
+        <w:t>Several limitations contextualize these findings and suggest directions for ongoing research.</w:t>
       </w:r>
     </w:p>
     <w:p>
@@ -20929,27 +20265,93 @@
         <w:rPr>
           <w:rFonts w:ascii="Times New Roman" w:hAnsi="Times New Roman"/>
           <w:b w:val="0"/>
+          <w:i/>
+          <w:color w:val="1A1A1A"/>
+          <w:sz w:val="22"/>
+        </w:rPr>
+        <w:t>Model and curricular domain scope:</w:t>
+      </w:r>
+      <w:r>
+        <w:rPr>
+          <w:rFonts w:ascii="Times New Roman" w:hAnsi="Times New Roman"/>
+          <w:b w:val="0"/>
           <w:i w:val="0"/>
           <w:color w:val="1A1A1A"/>
           <w:sz w:val="22"/>
         </w:rPr>
-        <w:t>Systems benchmarks were gathered on a dedicated single-GPU institutional server (NVIDIA RTX 3090, 24 GB VRAM) running Ollama. While representative of departmental hardware, alternative serving backends (e.g., vLLM with continuous batching or TensorRT-LLM) or different GPU architectures with varying memory bandwidth will yield different absolute throughput ceilings.</w:t>
-      </w:r>
-    </w:p>
-    <w:p>
-      <w:pPr>
-        <w:pStyle w:val="ListNumber"/>
-        <w:spacing w:before="20" w:after="40" w:line="276" w:lineRule="auto"/>
-      </w:pPr>
-      <w:r>
-        <w:rPr>
-          <w:rFonts w:ascii="Times New Roman" w:hAnsi="Times New Roman"/>
-          <w:b/>
+        <w:t xml:space="preserve"> The empirical evaluation focuses on Python programming using </w:t>
+      </w:r>
+      <w:r>
+        <w:rPr>
+          <w:rFonts w:ascii="Courier New" w:hAnsi="Courier New"/>
+          <w:color w:val="0F172A"/>
+          <w:sz w:val="21"/>
+        </w:rPr>
+        <w:t>Qwen2.5-Coder-7B-Instruct</w:t>
+      </w:r>
+      <w:r>
+        <w:rPr>
+          <w:rFonts w:ascii="Times New Roman" w:hAnsi="Times New Roman"/>
+          <w:b w:val="0"/>
           <w:i w:val="0"/>
           <w:color w:val="1A1A1A"/>
           <w:sz w:val="22"/>
         </w:rPr>
-        <w:t>Pedagogical Evaluation Scope and Evaluator Sample:</w:t>
+        <w:t xml:space="preserve"> (official Ollama tag: </w:t>
+      </w:r>
+      <w:r>
+        <w:rPr>
+          <w:rFonts w:ascii="Courier New" w:hAnsi="Courier New"/>
+          <w:color w:val="0F172A"/>
+          <w:sz w:val="21"/>
+        </w:rPr>
+        <w:t>qwen2.5-coder:7b</w:t>
+      </w:r>
+      <w:r>
+        <w:rPr>
+          <w:rFonts w:ascii="Times New Roman" w:hAnsi="Times New Roman"/>
+          <w:b w:val="0"/>
+          <w:i w:val="0"/>
+          <w:color w:val="1A1A1A"/>
+          <w:sz w:val="22"/>
+        </w:rPr>
+        <w:t xml:space="preserve">) and </w:t>
+      </w:r>
+      <w:r>
+        <w:rPr>
+          <w:rFonts w:ascii="Courier New" w:hAnsi="Courier New"/>
+          <w:color w:val="0F172A"/>
+          <w:sz w:val="21"/>
+        </w:rPr>
+        <w:t>nomic-embed-text</w:t>
+      </w:r>
+      <w:r>
+        <w:rPr>
+          <w:rFonts w:ascii="Times New Roman" w:hAnsi="Times New Roman"/>
+          <w:b w:val="0"/>
+          <w:i w:val="0"/>
+          <w:color w:val="1A1A1A"/>
+          <w:sz w:val="22"/>
+        </w:rPr>
+        <w:t xml:space="preserve"> (</w:t>
+      </w:r>
+      <w:r>
+        <w:rPr>
+          <w:rFonts w:ascii="Courier New" w:hAnsi="Courier New"/>
+          <w:color w:val="0F172A"/>
+          <w:sz w:val="21"/>
+        </w:rPr>
+        <w:t>nomic-embed-text:latest</w:t>
+      </w:r>
+      <w:r>
+        <w:rPr>
+          <w:rFonts w:ascii="Times New Roman" w:hAnsi="Times New Roman"/>
+          <w:b w:val="0"/>
+          <w:i w:val="0"/>
+          <w:color w:val="1A1A1A"/>
+          <w:sz w:val="22"/>
+        </w:rPr>
+        <w:t>). While the architectural workflow, incremental caching, and AST compilation principles extend naturally to other structured languages (e.g., Java, C++), different programming language grammars and model families may exhibit varying baseline syntax failure rates and generation latencies.</w:t>
       </w:r>
     </w:p>
     <w:p>
@@ -20960,27 +20362,11 @@
         <w:rPr>
           <w:rFonts w:ascii="Times New Roman" w:hAnsi="Times New Roman"/>
           <w:b w:val="0"/>
-          <w:i w:val="0"/>
-          <w:color w:val="1A1A1A"/>
-          <w:sz w:val="22"/>
-        </w:rPr>
-        <w:t>Our evaluation establishes high multi-judge correctness (4.24/5.0), distractor plausibility (4.63/5.0), pedagogical relevance (4.86/5.0), and 80.0% aggregate pedagogical acceptability with excellent multi-rater reliability (</w:t>
-      </w:r>
-      <w:r>
-        <w:rPr>
-          <w:rFonts w:ascii="Times New Roman" w:hAnsi="Times New Roman"/>
-          <w:color w:val="1A1A1A"/>
-          <w:sz w:val="22"/>
-        </w:rPr>
-        <w:t>ICC</w:t>
-      </w:r>
-      <w:r>
-        <w:rPr>
-          <w:rFonts w:ascii="Times New Roman" w:hAnsi="Times New Roman"/>
-          <w:color w:val="1A1A1A"/>
-          <w:sz w:val="22"/>
-        </w:rPr>
-        <w:t xml:space="preserve"> = 0.981</w:t>
+          <w:i/>
+          <w:color w:val="1A1A1A"/>
+          <w:sz w:val="22"/>
+        </w:rPr>
+        <w:t>Hardware environment and serving runtime:</w:t>
       </w:r>
       <w:r>
         <w:rPr>
@@ -20990,67 +20376,7 @@
           <w:color w:val="1A1A1A"/>
           <w:sz w:val="22"/>
         </w:rPr>
-        <w:t xml:space="preserve"> on correctness). However, expert and LLM rating rubrics evaluate content validity and surface quality rather than downstream student learning gains or empirical psychometric item discrimination (Item Response Theory), which require longitudinal classroom deployment. Additionally, while the evaluation panel paired two diverse frontier LLM judges (GPT-4o and Gemini 2.5 Flash) with calibrated human expert scoring, human ground-truth ratings were conducted by a single senior CS instructor following a strict rubric. While the high inter-rater agreement (</w:t>
-      </w:r>
-      <w:r>
-        <w:rPr>
-          <w:rFonts w:ascii="Times New Roman" w:hAnsi="Times New Roman"/>
-          <w:color w:val="1A1A1A"/>
-          <w:sz w:val="22"/>
-        </w:rPr>
-        <w:t>ICC</w:t>
-      </w:r>
-      <w:r>
-        <w:rPr>
-          <w:rFonts w:ascii="Times New Roman" w:hAnsi="Times New Roman"/>
-          <w:color w:val="1A1A1A"/>
-          <w:sz w:val="22"/>
-        </w:rPr>
-        <w:t xml:space="preserve"> = 0.981</w:t>
-      </w:r>
-      <w:r>
-        <w:rPr>
-          <w:rFonts w:ascii="Times New Roman" w:hAnsi="Times New Roman"/>
-          <w:b w:val="0"/>
-          <w:i w:val="0"/>
-          <w:color w:val="1A1A1A"/>
-          <w:sz w:val="22"/>
-        </w:rPr>
-        <w:t xml:space="preserve">, Fleiss' </w:t>
-      </w:r>
-      <w:r>
-        <w:rPr>
-          <w:rFonts w:ascii="Times New Roman" w:hAnsi="Times New Roman"/>
-          <w:color w:val="1A1A1A"/>
-          <w:sz w:val="22"/>
-        </w:rPr>
-        <w:t>κ = 0.610</w:t>
-      </w:r>
-      <w:r>
-        <w:rPr>
-          <w:rFonts w:ascii="Times New Roman" w:hAnsi="Times New Roman"/>
-          <w:b w:val="0"/>
-          <w:i w:val="0"/>
-          <w:color w:val="1A1A1A"/>
-          <w:sz w:val="22"/>
-        </w:rPr>
-        <w:t>) confirms robust alignment between the human instructor and frontier LLM judges, broader multi-institutional faculty panels across multiple instructors should be engaged in future work to capture diverse curricular emphases and pedagogical styles.</w:t>
-      </w:r>
-    </w:p>
-    <w:p>
-      <w:pPr>
-        <w:pStyle w:val="ListNumber"/>
-        <w:spacing w:before="20" w:after="40" w:line="276" w:lineRule="auto"/>
-      </w:pPr>
-      <w:r>
-        <w:rPr>
-          <w:rFonts w:ascii="Times New Roman" w:hAnsi="Times New Roman"/>
-          <w:b/>
-          <w:i w:val="0"/>
-          <w:color w:val="1A1A1A"/>
-          <w:sz w:val="22"/>
-        </w:rPr>
-        <w:t>Controlled Benchmarking vs. Longitudinal Traffic:</w:t>
+        <w:t xml:space="preserve"> Systems benchmarks were gathered on a dedicated single-GPU institutional server (NVIDIA RTX 3090, 24 GB VRAM) running Ollama. While representative of departmental hardware, alternative serving backends (e.g., vLLM with continuous batching or TensorRT-LLM) or different GPU architectures with varying memory bandwidth will yield different absolute throughput ceilings.</w:t>
       </w:r>
     </w:p>
     <w:p>
@@ -21061,11 +20387,116 @@
         <w:rPr>
           <w:rFonts w:ascii="Times New Roman" w:hAnsi="Times New Roman"/>
           <w:b w:val="0"/>
+          <w:i/>
+          <w:color w:val="1A1A1A"/>
+          <w:sz w:val="22"/>
+        </w:rPr>
+        <w:t>Pedagogical evaluation scope and evaluator sample:</w:t>
+      </w:r>
+      <w:r>
+        <w:rPr>
+          <w:rFonts w:ascii="Times New Roman" w:hAnsi="Times New Roman"/>
+          <w:b w:val="0"/>
           <w:i w:val="0"/>
           <w:color w:val="1A1A1A"/>
           <w:sz w:val="22"/>
         </w:rPr>
-        <w:t>System concurrency (</w:t>
+        <w:t xml:space="preserve"> Our evaluation establishes high multi-judge correctness (4.24/5.0), distractor plausibility (4.63/5.0), pedagogical relevance (4.86/5.0), and 80.0% aggregate pedagogical acceptability with excellent multi-rater reliability (</w:t>
+      </w:r>
+      <w:r>
+        <w:rPr>
+          <w:rFonts w:ascii="Times New Roman" w:hAnsi="Times New Roman"/>
+          <w:color w:val="1A1A1A"/>
+          <w:sz w:val="22"/>
+        </w:rPr>
+        <w:t>ICC</w:t>
+      </w:r>
+      <w:r>
+        <w:rPr>
+          <w:rFonts w:ascii="Times New Roman" w:hAnsi="Times New Roman"/>
+          <w:color w:val="1A1A1A"/>
+          <w:sz w:val="22"/>
+        </w:rPr>
+        <w:t xml:space="preserve"> = 0.981</w:t>
+      </w:r>
+      <w:r>
+        <w:rPr>
+          <w:rFonts w:ascii="Times New Roman" w:hAnsi="Times New Roman"/>
+          <w:b w:val="0"/>
+          <w:i w:val="0"/>
+          <w:color w:val="1A1A1A"/>
+          <w:sz w:val="22"/>
+        </w:rPr>
+        <w:t xml:space="preserve"> on correctness). However, expert and LLM rating rubrics evaluate content validity and surface quality rather than downstream student learning gains or empirical psychometric item discrimination (Item Response Theory), which require longitudinal classroom deployment. Additionally, while the evaluation panel paired two diverse frontier LLM judges (GPT-4o and Gemini 2.5 Flash) with calibrated human expert scoring, human ground-truth ratings were conducted by a senior CS instructor following a strict rubric. While the high inter-rater agreement (</w:t>
+      </w:r>
+      <w:r>
+        <w:rPr>
+          <w:rFonts w:ascii="Times New Roman" w:hAnsi="Times New Roman"/>
+          <w:color w:val="1A1A1A"/>
+          <w:sz w:val="22"/>
+        </w:rPr>
+        <w:t>ICC</w:t>
+      </w:r>
+      <w:r>
+        <w:rPr>
+          <w:rFonts w:ascii="Times New Roman" w:hAnsi="Times New Roman"/>
+          <w:color w:val="1A1A1A"/>
+          <w:sz w:val="22"/>
+        </w:rPr>
+        <w:t xml:space="preserve"> = 0.981</w:t>
+      </w:r>
+      <w:r>
+        <w:rPr>
+          <w:rFonts w:ascii="Times New Roman" w:hAnsi="Times New Roman"/>
+          <w:b w:val="0"/>
+          <w:i w:val="0"/>
+          <w:color w:val="1A1A1A"/>
+          <w:sz w:val="22"/>
+        </w:rPr>
+        <w:t xml:space="preserve">, Fleiss' </w:t>
+      </w:r>
+      <w:r>
+        <w:rPr>
+          <w:rFonts w:ascii="Times New Roman" w:hAnsi="Times New Roman"/>
+          <w:color w:val="1A1A1A"/>
+          <w:sz w:val="22"/>
+        </w:rPr>
+        <w:t>κ = 0.610</w:t>
+      </w:r>
+      <w:r>
+        <w:rPr>
+          <w:rFonts w:ascii="Times New Roman" w:hAnsi="Times New Roman"/>
+          <w:b w:val="0"/>
+          <w:i w:val="0"/>
+          <w:color w:val="1A1A1A"/>
+          <w:sz w:val="22"/>
+        </w:rPr>
+        <w:t>) confirms robust alignment between the human instructor and frontier LLM judges, broader multi-institutional faculty panels across multiple instructors should be engaged in future work to capture diverse curricular emphases and pedagogical styles.</w:t>
+      </w:r>
+    </w:p>
+    <w:p>
+      <w:pPr>
+        <w:spacing w:before="0" w:after="120" w:line="276" w:lineRule="auto"/>
+      </w:pPr>
+      <w:r>
+        <w:rPr>
+          <w:rFonts w:ascii="Times New Roman" w:hAnsi="Times New Roman"/>
+          <w:b w:val="0"/>
+          <w:i/>
+          <w:color w:val="1A1A1A"/>
+          <w:sz w:val="22"/>
+        </w:rPr>
+        <w:t>Controlled benchmarking versus longitudinal traffic:</w:t>
+      </w:r>
+      <w:r>
+        <w:rPr>
+          <w:rFonts w:ascii="Times New Roman" w:hAnsi="Times New Roman"/>
+          <w:b w:val="0"/>
+          <w:i w:val="0"/>
+          <w:color w:val="1A1A1A"/>
+          <w:sz w:val="22"/>
+        </w:rPr>
+        <w:t xml:space="preserve"> System concurrency (</w:t>
       </w:r>
       <w:r>
         <w:rPr>
@@ -21162,7 +20593,7 @@
           <w:color w:val="0F172A"/>
           <w:sz w:val="28"/>
         </w:rPr>
-        <w:t>9 Open-source artifact and reproducibility</w:t>
+        <w:t>8 Conclusion and reproducibility</w:t>
       </w:r>
     </w:p>
     <w:p>
@@ -21177,7 +20608,7 @@
           <w:color w:val="1A1A1A"/>
           <w:sz w:val="22"/>
         </w:rPr>
-        <w:t>To support reproducibility, the complete implementation, evaluation benchmarks, and replication code are made publicly available as an open-source research artifact at [Anonymized Repository URL for Double-Blind Review].</w:t>
+        <w:t>This study investigated how course-grounded programming MCQ generation can be operated as an efficient, persistent, fully self-hosted Moodle service under a single-GPU constraint. The work deliberately does not claim novelty from LLM-based MCQ generation, RAG, programming-question generation, Moodle integration, local inference, embedding caching, or GPU benchmarking individually. Instead, it treats practical generative assessment as an end-to-end educational-technology systems problem.</w:t>
       </w:r>
     </w:p>
     <w:p>
@@ -21192,23 +20623,123 @@
           <w:color w:val="1A1A1A"/>
           <w:sz w:val="22"/>
         </w:rPr>
-        <w:t>The repository includes the Moodle plugin integration layer, incremental course ingestion and chunking routines, SHA-256 embedding-cache service, vector retrieval engine, local LLM interface, two-tier schema and AST validator, concurrent benchmark workload generator, hardware monitoring telemetry scripts, prompt templates, and raw evaluation logs.</w:t>
-      </w:r>
-    </w:p>
-    <w:p>
-      <w:pPr>
-        <w:keepNext/>
-        <w:spacing w:before="280" w:after="80"/>
-      </w:pPr>
-      <w:r>
-        <w:rPr>
-          <w:rFonts w:ascii="Times New Roman" w:hAnsi="Times New Roman"/>
-          <w:b/>
+        <w:t>The empirical findings confirm that incremental course processing, controlled retrieval context, structured generation, deterministic validation, and bounded recovery materially improve the complete instructor-facing workflow while preserving expert-rated MCQ quality. Incremental SHA-256 chunk hashing reduced knowledge-base indexing latency from 53.7 ms to 0.1 ms (a 99.8% reduction, reaching up to a 37,008.4× speedup under multi-module course conditions), which translates to a 1.06× net end-to-end speedup for single-item generation while preserving vital GPU compute bandwidth and VRAM bus availability for autoregressive decoding. Controlled context budgeting and bounded semantic retrieval (</w:t>
+      </w:r>
+      <w:r>
+        <w:rPr>
+          <w:rFonts w:ascii="Times New Roman" w:hAnsi="Times New Roman"/>
+          <w:color w:val="1A1A1A"/>
+          <w:sz w:val="22"/>
+        </w:rPr>
+        <w:t>Top-</w:t>
+      </w:r>
+      <w:r>
+        <w:rPr>
+          <w:rFonts w:ascii="Times New Roman" w:hAnsi="Times New Roman"/>
+          <w:i/>
+          <w:color w:val="1A1A1A"/>
+          <w:sz w:val="22"/>
+        </w:rPr>
+        <w:t>K</w:t>
+      </w:r>
+      <w:r>
+        <w:rPr>
+          <w:rFonts w:ascii="Times New Roman" w:hAnsi="Times New Roman"/>
+          <w:color w:val="1A1A1A"/>
+          <w:sz w:val="22"/>
+        </w:rPr>
+        <w:t xml:space="preserve"> = 3</w:t>
+      </w:r>
+      <w:r>
+        <w:rPr>
+          <w:rFonts w:ascii="Times New Roman" w:hAnsi="Times New Roman"/>
+          <w:b w:val="0"/>
           <w:i w:val="0"/>
-          <w:color w:val="0F172A"/>
-          <w:sz w:val="28"/>
-        </w:rPr>
-        <w:t>10 Conclusion</w:t>
+          <w:color w:val="1A1A1A"/>
+          <w:sz w:val="22"/>
+        </w:rPr>
+        <w:t xml:space="preserve">, ~512 tokens) achieved strong curriculum groundedness (4.11/5.0) while compressing prompt context by 72.2% compared to static full-lesson injection. Under concurrent multi-instructor authoring workloads, the single-GPU service sustained steady aggregate throughput of 43.8 to 49.2 questions per minute across up to </w:t>
+      </w:r>
+      <w:r>
+        <w:rPr>
+          <w:rFonts w:ascii="Times New Roman" w:hAnsi="Times New Roman"/>
+          <w:i/>
+          <w:color w:val="1A1A1A"/>
+          <w:sz w:val="22"/>
+        </w:rPr>
+        <w:t>C</w:t>
+      </w:r>
+      <w:r>
+        <w:rPr>
+          <w:rFonts w:ascii="Times New Roman" w:hAnsi="Times New Roman"/>
+          <w:color w:val="1A1A1A"/>
+          <w:sz w:val="22"/>
+        </w:rPr>
+        <w:t xml:space="preserve"> = 20</w:t>
+      </w:r>
+      <w:r>
+        <w:rPr>
+          <w:rFonts w:ascii="Times New Roman" w:hAnsi="Times New Roman"/>
+          <w:b w:val="0"/>
+          <w:i w:val="0"/>
+          <w:color w:val="1A1A1A"/>
+          <w:sz w:val="22"/>
+        </w:rPr>
+        <w:t xml:space="preserve"> simultaneous clients, delivering median response times of 1.36s (</w:t>
+      </w:r>
+      <w:r>
+        <w:rPr>
+          <w:rFonts w:ascii="Times New Roman" w:hAnsi="Times New Roman"/>
+          <w:i/>
+          <w:color w:val="1A1A1A"/>
+          <w:sz w:val="22"/>
+        </w:rPr>
+        <w:t>C</w:t>
+      </w:r>
+      <w:r>
+        <w:rPr>
+          <w:rFonts w:ascii="Times New Roman" w:hAnsi="Times New Roman"/>
+          <w:color w:val="1A1A1A"/>
+          <w:sz w:val="22"/>
+        </w:rPr>
+        <w:t>=1</w:t>
+      </w:r>
+      <w:r>
+        <w:rPr>
+          <w:rFonts w:ascii="Times New Roman" w:hAnsi="Times New Roman"/>
+          <w:b w:val="0"/>
+          <w:i w:val="0"/>
+          <w:color w:val="1A1A1A"/>
+          <w:sz w:val="22"/>
+        </w:rPr>
+        <w:t>) to 3.56s (</w:t>
+      </w:r>
+      <w:r>
+        <w:rPr>
+          <w:rFonts w:ascii="Times New Roman" w:hAnsi="Times New Roman"/>
+          <w:i/>
+          <w:color w:val="1A1A1A"/>
+          <w:sz w:val="22"/>
+        </w:rPr>
+        <w:t>C</w:t>
+      </w:r>
+      <w:r>
+        <w:rPr>
+          <w:rFonts w:ascii="Times New Roman" w:hAnsi="Times New Roman"/>
+          <w:color w:val="1A1A1A"/>
+          <w:sz w:val="22"/>
+        </w:rPr>
+        <w:t>=5</w:t>
+      </w:r>
+      <w:r>
+        <w:rPr>
+          <w:rFonts w:ascii="Times New Roman" w:hAnsi="Times New Roman"/>
+          <w:b w:val="0"/>
+          <w:i w:val="0"/>
+          <w:color w:val="1A1A1A"/>
+          <w:sz w:val="22"/>
+        </w:rPr>
+        <w:t>) with a 100% execution success rate and peak VRAM safely contained at 13.44 GB against the 24 GB hardware ceiling. Furthermore, 80.0% of generated MCQs were classified as directly pedagogically acceptable by the multi-judge evaluation panel, with frontier LLM judges exhibiting discriminative sensitivity to nuanced logic traps while deterministic AST compilation verified code syntax compilability.</w:t>
       </w:r>
     </w:p>
     <w:p>
@@ -21223,7 +20754,7 @@
           <w:color w:val="1A1A1A"/>
           <w:sz w:val="22"/>
         </w:rPr>
-        <w:t>This study investigated how course-grounded programming MCQ generation can be operated as an efficient, persistent, fully self-hosted Moodle service under a single-GPU constraint. The work deliberately does not claim novelty from LLM-based MCQ generation, RAG, programming-question generation, Moodle integration, local inference, embedding caching, or GPU benchmarking individually. Instead, it treats practical generative assessment as an end-to-end educational-technology systems problem.</w:t>
+        <w:t>To support reproducibility and community adoption, the complete implementation, evaluation benchmarks, and replication code are made publicly available as an open-source research artifact at [Anonymized Repository URL for Double-Blind Review]. The repository includes the Moodle plugin integration layer, incremental course ingestion routines, SHA-256 embedding-cache service, vector retrieval engine, local LLM interface, two-tier schema and AST validator, concurrent benchmark workload generator, hardware monitoring telemetry scripts, prompt templates, and raw evaluation logs.</w:t>
       </w:r>
     </w:p>
     <w:p>
@@ -21238,504 +20769,7 @@
           <w:color w:val="1A1A1A"/>
           <w:sz w:val="22"/>
         </w:rPr>
-        <w:t>The empirical evaluation confirms that incremental course processing, controlled retrieval context, structured generation, deterministic validation, and bounded recovery materially improve the complete instructor-facing workflow while preserving expert-rated MCQ quality:</w:t>
-      </w:r>
-    </w:p>
-    <w:p>
-      <w:pPr>
-        <w:pStyle w:val="ListBullet"/>
-        <w:spacing w:before="20" w:after="40" w:line="276" w:lineRule="auto"/>
-      </w:pPr>
-      <w:r>
-        <w:rPr>
-          <w:rFonts w:ascii="Times New Roman" w:hAnsi="Times New Roman"/>
-          <w:b w:val="0"/>
-          <w:i w:val="0"/>
-          <w:color w:val="1A1A1A"/>
-          <w:sz w:val="22"/>
-        </w:rPr>
-        <w:t xml:space="preserve">The optimized pipeline reduced knowledge-base indexing latency from </w:t>
-      </w:r>
-      <w:r>
-        <w:rPr>
-          <w:rFonts w:ascii="Times New Roman" w:hAnsi="Times New Roman"/>
-          <w:b/>
-          <w:i w:val="0"/>
-          <w:color w:val="1A1A1A"/>
-          <w:sz w:val="22"/>
-        </w:rPr>
-        <w:t>53.7 ms to 0.1 ms</w:t>
-      </w:r>
-      <w:r>
-        <w:rPr>
-          <w:rFonts w:ascii="Times New Roman" w:hAnsi="Times New Roman"/>
-          <w:b w:val="0"/>
-          <w:i w:val="0"/>
-          <w:color w:val="1A1A1A"/>
-          <w:sz w:val="22"/>
-        </w:rPr>
-        <w:t xml:space="preserve">, a </w:t>
-      </w:r>
-      <w:r>
-        <w:rPr>
-          <w:rFonts w:ascii="Times New Roman" w:hAnsi="Times New Roman"/>
-          <w:b/>
-          <w:i w:val="0"/>
-          <w:color w:val="1A1A1A"/>
-          <w:sz w:val="22"/>
-        </w:rPr>
-        <w:t>99.8% reduction</w:t>
-      </w:r>
-      <w:r>
-        <w:rPr>
-          <w:rFonts w:ascii="Times New Roman" w:hAnsi="Times New Roman"/>
-          <w:b w:val="0"/>
-          <w:i w:val="0"/>
-          <w:color w:val="1A1A1A"/>
-          <w:sz w:val="22"/>
-        </w:rPr>
-        <w:t xml:space="preserve"> (and up to a </w:t>
-      </w:r>
-      <w:r>
-        <w:rPr>
-          <w:rFonts w:ascii="Times New Roman" w:hAnsi="Times New Roman"/>
-          <w:b/>
-          <w:i w:val="0"/>
-          <w:color w:val="1A1A1A"/>
-          <w:sz w:val="22"/>
-        </w:rPr>
-        <w:t>37,008.4× speedup</w:t>
-      </w:r>
-      <w:r>
-        <w:rPr>
-          <w:rFonts w:ascii="Times New Roman" w:hAnsi="Times New Roman"/>
-          <w:b w:val="0"/>
-          <w:i w:val="0"/>
-          <w:color w:val="1A1A1A"/>
-          <w:sz w:val="22"/>
-        </w:rPr>
-        <w:t xml:space="preserve"> under 7-module course conditions), which translates to a </w:t>
-      </w:r>
-      <w:r>
-        <w:rPr>
-          <w:rFonts w:ascii="Times New Roman" w:hAnsi="Times New Roman"/>
-          <w:b/>
-          <w:i w:val="0"/>
-          <w:color w:val="1A1A1A"/>
-          <w:sz w:val="22"/>
-        </w:rPr>
-        <w:t>1.06× net end-to-end speedup</w:t>
-      </w:r>
-      <w:r>
-        <w:rPr>
-          <w:rFonts w:ascii="Times New Roman" w:hAnsi="Times New Roman"/>
-          <w:b w:val="0"/>
-          <w:i w:val="0"/>
-          <w:color w:val="1A1A1A"/>
-          <w:sz w:val="22"/>
-        </w:rPr>
-        <w:t xml:space="preserve"> for isolated single-item generation (from 1551.0 ms to 1462.7 ms) as local autoregressive LLM decoding accounts for 96.5% of baseline runtime and dominates steady-state execution (&gt;99%);</w:t>
-      </w:r>
-    </w:p>
-    <w:p>
-      <w:pPr>
-        <w:pStyle w:val="ListBullet"/>
-        <w:spacing w:before="20" w:after="40" w:line="276" w:lineRule="auto"/>
-      </w:pPr>
-      <w:r>
-        <w:rPr>
-          <w:rFonts w:ascii="Times New Roman" w:hAnsi="Times New Roman"/>
-          <w:b w:val="0"/>
-          <w:i w:val="0"/>
-          <w:color w:val="1A1A1A"/>
-          <w:sz w:val="22"/>
-        </w:rPr>
-        <w:t xml:space="preserve">Incremental SHA-256 embedding reuse accounted for the largest share of preprocessing improvement, reducing GPU embedding computation by </w:t>
-      </w:r>
-      <w:r>
-        <w:rPr>
-          <w:rFonts w:ascii="Times New Roman" w:hAnsi="Times New Roman"/>
-          <w:b/>
-          <w:i w:val="0"/>
-          <w:color w:val="1A1A1A"/>
-          <w:sz w:val="22"/>
-        </w:rPr>
-        <w:t>99.8%</w:t>
-      </w:r>
-      <w:r>
-        <w:rPr>
-          <w:rFonts w:ascii="Times New Roman" w:hAnsi="Times New Roman"/>
-          <w:b w:val="0"/>
-          <w:i w:val="0"/>
-          <w:color w:val="1A1A1A"/>
-          <w:sz w:val="22"/>
-        </w:rPr>
-        <w:t xml:space="preserve"> and eliminating resource contention between indexing and generation on the shared GPU;</w:t>
-      </w:r>
-    </w:p>
-    <w:p>
-      <w:pPr>
-        <w:pStyle w:val="ListBullet"/>
-        <w:spacing w:before="20" w:after="40" w:line="276" w:lineRule="auto"/>
-      </w:pPr>
-      <w:r>
-        <w:rPr>
-          <w:rFonts w:ascii="Times New Roman" w:hAnsi="Times New Roman"/>
-          <w:b w:val="0"/>
-          <w:i w:val="0"/>
-          <w:color w:val="1A1A1A"/>
-          <w:sz w:val="22"/>
-        </w:rPr>
-        <w:t>Controlled context budgeting and bounded semantic retrieval (</w:t>
-      </w:r>
-      <w:r>
-        <w:rPr>
-          <w:rFonts w:ascii="Times New Roman" w:hAnsi="Times New Roman"/>
-          <w:color w:val="1A1A1A"/>
-          <w:sz w:val="22"/>
-        </w:rPr>
-        <w:t>Top-</w:t>
-      </w:r>
-      <w:r>
-        <w:rPr>
-          <w:rFonts w:ascii="Times New Roman" w:hAnsi="Times New Roman"/>
-          <w:i/>
-          <w:color w:val="1A1A1A"/>
-          <w:sz w:val="22"/>
-        </w:rPr>
-        <w:t>K</w:t>
-      </w:r>
-      <w:r>
-        <w:rPr>
-          <w:rFonts w:ascii="Times New Roman" w:hAnsi="Times New Roman"/>
-          <w:color w:val="1A1A1A"/>
-          <w:sz w:val="22"/>
-        </w:rPr>
-        <w:t xml:space="preserve"> = 3</w:t>
-      </w:r>
-      <w:r>
-        <w:rPr>
-          <w:rFonts w:ascii="Times New Roman" w:hAnsi="Times New Roman"/>
-          <w:b w:val="0"/>
-          <w:i w:val="0"/>
-          <w:color w:val="1A1A1A"/>
-          <w:sz w:val="22"/>
-        </w:rPr>
-        <w:t xml:space="preserve">, ~512 tokens) achieved strict curriculum groundedness (4.11/5.0) while compressing prompt context by </w:t>
-      </w:r>
-      <w:r>
-        <w:rPr>
-          <w:rFonts w:ascii="Times New Roman" w:hAnsi="Times New Roman"/>
-          <w:b/>
-          <w:i w:val="0"/>
-          <w:color w:val="1A1A1A"/>
-          <w:sz w:val="22"/>
-        </w:rPr>
-        <w:t>72.2%</w:t>
-      </w:r>
-      <w:r>
-        <w:rPr>
-          <w:rFonts w:ascii="Times New Roman" w:hAnsi="Times New Roman"/>
-          <w:b w:val="0"/>
-          <w:i w:val="0"/>
-          <w:color w:val="1A1A1A"/>
-          <w:sz w:val="22"/>
-        </w:rPr>
-        <w:t xml:space="preserve"> compared to static full-lesson injection (Config C, ~1,840 tokens), avoiding prompt bloat while eliminating the curriculum misalignment risks of raw zero-shot generation (Config D);</w:t>
-      </w:r>
-    </w:p>
-    <w:p>
-      <w:pPr>
-        <w:pStyle w:val="ListBullet"/>
-        <w:spacing w:before="20" w:after="40" w:line="276" w:lineRule="auto"/>
-      </w:pPr>
-      <w:r>
-        <w:rPr>
-          <w:rFonts w:ascii="Times New Roman" w:hAnsi="Times New Roman"/>
-          <w:b w:val="0"/>
-          <w:i w:val="0"/>
-          <w:color w:val="1A1A1A"/>
-          <w:sz w:val="22"/>
-        </w:rPr>
-        <w:t xml:space="preserve">The single-GPU service sustained steady aggregate throughput of </w:t>
-      </w:r>
-      <w:r>
-        <w:rPr>
-          <w:rFonts w:ascii="Times New Roman" w:hAnsi="Times New Roman"/>
-          <w:b/>
-          <w:i w:val="0"/>
-          <w:color w:val="1A1A1A"/>
-          <w:sz w:val="22"/>
-        </w:rPr>
-        <w:t>43.8 to 49.2 questions/min (0.73–0.82 Q/s)</w:t>
-      </w:r>
-      <w:r>
-        <w:rPr>
-          <w:rFonts w:ascii="Times New Roman" w:hAnsi="Times New Roman"/>
-          <w:b w:val="0"/>
-          <w:i w:val="0"/>
-          <w:color w:val="1A1A1A"/>
-          <w:sz w:val="22"/>
-        </w:rPr>
-        <w:t xml:space="preserve"> under concurrent 5-question batched instructor authoring workloads across up to </w:t>
-      </w:r>
-      <w:r>
-        <w:rPr>
-          <w:rFonts w:ascii="Times New Roman" w:hAnsi="Times New Roman"/>
-          <w:i/>
-          <w:color w:val="1A1A1A"/>
-          <w:sz w:val="22"/>
-        </w:rPr>
-        <w:t>C</w:t>
-      </w:r>
-      <w:r>
-        <w:rPr>
-          <w:rFonts w:ascii="Times New Roman" w:hAnsi="Times New Roman"/>
-          <w:color w:val="1A1A1A"/>
-          <w:sz w:val="22"/>
-        </w:rPr>
-        <w:t xml:space="preserve"> = 20</w:t>
-      </w:r>
-      <w:r>
-        <w:rPr>
-          <w:rFonts w:ascii="Times New Roman" w:hAnsi="Times New Roman"/>
-          <w:b w:val="0"/>
-          <w:i w:val="0"/>
-          <w:color w:val="1A1A1A"/>
-          <w:sz w:val="22"/>
-        </w:rPr>
-        <w:t xml:space="preserve"> simultaneous clients (compared with 0.68 Q/s for unbatched single requests), delivering median response times of </w:t>
-      </w:r>
-      <w:r>
-        <w:rPr>
-          <w:rFonts w:ascii="Times New Roman" w:hAnsi="Times New Roman"/>
-          <w:b/>
-          <w:i w:val="0"/>
-          <w:color w:val="1A1A1A"/>
-          <w:sz w:val="22"/>
-        </w:rPr>
-        <w:t>1.36s (</w:t>
-      </w:r>
-      <w:r>
-        <w:rPr>
-          <w:rFonts w:ascii="Times New Roman" w:hAnsi="Times New Roman"/>
-          <w:b/>
-          <w:i/>
-          <w:color w:val="1A1A1A"/>
-          <w:sz w:val="22"/>
-        </w:rPr>
-        <w:t>C</w:t>
-      </w:r>
-      <w:r>
-        <w:rPr>
-          <w:rFonts w:ascii="Times New Roman" w:hAnsi="Times New Roman"/>
-          <w:b/>
-          <w:color w:val="1A1A1A"/>
-          <w:sz w:val="22"/>
-        </w:rPr>
-        <w:t>=1</w:t>
-      </w:r>
-      <w:r>
-        <w:rPr>
-          <w:rFonts w:ascii="Times New Roman" w:hAnsi="Times New Roman"/>
-          <w:b/>
-          <w:i w:val="0"/>
-          <w:color w:val="1A1A1A"/>
-          <w:sz w:val="22"/>
-        </w:rPr>
-        <w:t>) to 3.56s (</w:t>
-      </w:r>
-      <w:r>
-        <w:rPr>
-          <w:rFonts w:ascii="Times New Roman" w:hAnsi="Times New Roman"/>
-          <w:b/>
-          <w:i/>
-          <w:color w:val="1A1A1A"/>
-          <w:sz w:val="22"/>
-        </w:rPr>
-        <w:t>C</w:t>
-      </w:r>
-      <w:r>
-        <w:rPr>
-          <w:rFonts w:ascii="Times New Roman" w:hAnsi="Times New Roman"/>
-          <w:b/>
-          <w:color w:val="1A1A1A"/>
-          <w:sz w:val="22"/>
-        </w:rPr>
-        <w:t>=5</w:t>
-      </w:r>
-      <w:r>
-        <w:rPr>
-          <w:rFonts w:ascii="Times New Roman" w:hAnsi="Times New Roman"/>
-          <w:b/>
-          <w:i w:val="0"/>
-          <w:color w:val="1A1A1A"/>
-          <w:sz w:val="22"/>
-        </w:rPr>
-        <w:t>)</w:t>
-      </w:r>
-      <w:r>
-        <w:rPr>
-          <w:rFonts w:ascii="Times New Roman" w:hAnsi="Times New Roman"/>
-          <w:b w:val="0"/>
-          <w:i w:val="0"/>
-          <w:color w:val="1A1A1A"/>
-          <w:sz w:val="22"/>
-        </w:rPr>
-        <w:t xml:space="preserve"> with a </w:t>
-      </w:r>
-      <w:r>
-        <w:rPr>
-          <w:rFonts w:ascii="Times New Roman" w:hAnsi="Times New Roman"/>
-          <w:b/>
-          <w:i w:val="0"/>
-          <w:color w:val="1A1A1A"/>
-          <w:sz w:val="22"/>
-        </w:rPr>
-        <w:t>100% execution success rate</w:t>
-      </w:r>
-      <w:r>
-        <w:rPr>
-          <w:rFonts w:ascii="Times New Roman" w:hAnsi="Times New Roman"/>
-          <w:b w:val="0"/>
-          <w:i w:val="0"/>
-          <w:color w:val="1A1A1A"/>
-          <w:sz w:val="22"/>
-        </w:rPr>
-        <w:t xml:space="preserve"> and peak VRAM safely contained at </w:t>
-      </w:r>
-      <w:r>
-        <w:rPr>
-          <w:rFonts w:ascii="Times New Roman" w:hAnsi="Times New Roman"/>
-          <w:b/>
-          <w:i w:val="0"/>
-          <w:color w:val="1A1A1A"/>
-          <w:sz w:val="22"/>
-        </w:rPr>
-        <w:t>13.44 GB</w:t>
-      </w:r>
-      <w:r>
-        <w:rPr>
-          <w:rFonts w:ascii="Times New Roman" w:hAnsi="Times New Roman"/>
-          <w:b w:val="0"/>
-          <w:i w:val="0"/>
-          <w:color w:val="1A1A1A"/>
-          <w:sz w:val="22"/>
-        </w:rPr>
-        <w:t xml:space="preserve"> (out of 24 GB) using the local </w:t>
-      </w:r>
-      <w:r>
-        <w:rPr>
-          <w:rFonts w:ascii="Courier New" w:hAnsi="Courier New"/>
-          <w:color w:val="0F172A"/>
-          <w:sz w:val="21"/>
-        </w:rPr>
-        <w:t>Qwen2.5-Coder-7B-Instruct</w:t>
-      </w:r>
-      <w:r>
-        <w:rPr>
-          <w:rFonts w:ascii="Times New Roman" w:hAnsi="Times New Roman"/>
-          <w:b w:val="0"/>
-          <w:i w:val="0"/>
-          <w:color w:val="1A1A1A"/>
-          <w:sz w:val="22"/>
-        </w:rPr>
-        <w:t xml:space="preserve"> model (tag: </w:t>
-      </w:r>
-      <w:r>
-        <w:rPr>
-          <w:rFonts w:ascii="Courier New" w:hAnsi="Courier New"/>
-          <w:color w:val="0F172A"/>
-          <w:sz w:val="21"/>
-        </w:rPr>
-        <w:t>qwen2.5-coder:7b</w:t>
-      </w:r>
-      <w:r>
-        <w:rPr>
-          <w:rFonts w:ascii="Times New Roman" w:hAnsi="Times New Roman"/>
-          <w:b w:val="0"/>
-          <w:i w:val="0"/>
-          <w:color w:val="1A1A1A"/>
-          <w:sz w:val="22"/>
-        </w:rPr>
-        <w:t>);</w:t>
-      </w:r>
-    </w:p>
-    <w:p>
-      <w:pPr>
-        <w:pStyle w:val="ListBullet"/>
-        <w:spacing w:before="20" w:after="40" w:line="276" w:lineRule="auto"/>
-      </w:pPr>
-      <w:r>
-        <w:rPr>
-          <w:rFonts w:ascii="Times New Roman" w:hAnsi="Times New Roman"/>
-          <w:b/>
-          <w:i w:val="0"/>
-          <w:color w:val="1A1A1A"/>
-          <w:sz w:val="22"/>
-        </w:rPr>
-        <w:t>80.0% of generated MCQs</w:t>
-      </w:r>
-      <w:r>
-        <w:rPr>
-          <w:rFonts w:ascii="Times New Roman" w:hAnsi="Times New Roman"/>
-          <w:b w:val="0"/>
-          <w:i w:val="0"/>
-          <w:color w:val="1A1A1A"/>
-          <w:sz w:val="22"/>
-        </w:rPr>
-        <w:t xml:space="preserve"> were classified by the multi-judge panel as pedagogically acceptable (4.24/5.0 technical correctness, 4.86/5.0 pedagogical relevance, and 4.94/5.0 code executability), with frontier LLM judges (OpenAI GPT-4o [model ID: </w:t>
-      </w:r>
-      <w:r>
-        <w:rPr>
-          <w:rFonts w:ascii="Courier New" w:hAnsi="Courier New"/>
-          <w:color w:val="0F172A"/>
-          <w:sz w:val="21"/>
-        </w:rPr>
-        <w:t>gpt-4o</w:t>
-      </w:r>
-      <w:r>
-        <w:rPr>
-          <w:rFonts w:ascii="Times New Roman" w:hAnsi="Times New Roman"/>
-          <w:b w:val="0"/>
-          <w:i w:val="0"/>
-          <w:color w:val="1A1A1A"/>
-          <w:sz w:val="22"/>
-        </w:rPr>
-        <w:t xml:space="preserve">] and Google Gemini 2.5 Flash [model ID: </w:t>
-      </w:r>
-      <w:r>
-        <w:rPr>
-          <w:rFonts w:ascii="Courier New" w:hAnsi="Courier New"/>
-          <w:color w:val="0F172A"/>
-          <w:sz w:val="21"/>
-        </w:rPr>
-        <w:t>gemini-2.5-flash</w:t>
-      </w:r>
-      <w:r>
-        <w:rPr>
-          <w:rFonts w:ascii="Times New Roman" w:hAnsi="Times New Roman"/>
-          <w:b w:val="0"/>
-          <w:i w:val="0"/>
-          <w:color w:val="1A1A1A"/>
-          <w:sz w:val="22"/>
-        </w:rPr>
-        <w:t>]) exhibiting discriminative sensitivity to nuanced logic traps while deterministic AST compilation verified code syntax compilability.</w:t>
-      </w:r>
-    </w:p>
-    <w:p>
-      <w:pPr>
-        <w:spacing w:before="0" w:after="120" w:line="276" w:lineRule="auto"/>
-      </w:pPr>
-      <w:r>
-        <w:rPr>
-          <w:rFonts w:ascii="Times New Roman" w:hAnsi="Times New Roman"/>
-          <w:b w:val="0"/>
-          <w:i w:val="0"/>
-          <w:color w:val="1A1A1A"/>
-          <w:sz w:val="22"/>
-        </w:rPr>
-        <w:t>More broadly, the study demonstrates that educational RAG should be evaluated beyond model accuracy or isolated inference time. In persistent institutional deployments, course-knowledge maintenance, retrieval context, structured validation, failure recovery, resource contention, and instructor oversight jointly determine whether generative assessment is operationally useful.</w:t>
+        <w:t>More broadly, the study demonstrates that educational RAG should be evaluated beyond isolated model accuracy or standalone inference latency. In persistent institutional deployments, course-knowledge maintenance, retrieval context, structured validation, failure recovery, resource contention, and instructor oversight jointly determine whether generative assessment is operationally viable and educationally sound.</w:t>
       </w:r>
     </w:p>
     <w:p>

</xml_diff>

<commit_message>
docs: enrich literature review with recent EAIT citations and recompile publication artifacts
</commit_message>
<xml_diff>
--- a/experiment/papers/Blinded_Manuscript_EAIT.docx
+++ b/experiment/papers/Blinded_Manuscript_EAIT.docx
@@ -521,7 +521,27 @@
           <w:color w:val="1A1A1A"/>
           <w:sz w:val="22"/>
         </w:rPr>
-        <w:t>Mucciaccia et al. (2025) investigated automatic MCQ generation and evaluation with LLMs, establishing automated question generation as a substantive research direction. Lewis et al. (2020) introduced RAG as a framework that combines parametric generation with retrieved external knowledge. In educational settings, this architecture allows generated content to be grounded in course resources rather than solely in model parameters.</w:t>
+        <w:t xml:space="preserve">Mucciaccia et al. (2025) investigated automatic MCQ generation and evaluation with LLMs, establishing automated question generation as a substantive research direction. Within </w:t>
+      </w:r>
+      <w:r>
+        <w:rPr>
+          <w:rFonts w:ascii="Times New Roman" w:hAnsi="Times New Roman"/>
+          <w:b w:val="0"/>
+          <w:i/>
+          <w:color w:val="1A1A1A"/>
+          <w:sz w:val="22"/>
+        </w:rPr>
+        <w:t>Education and Information Technologies</w:t>
+      </w:r>
+      <w:r>
+        <w:rPr>
+          <w:rFonts w:ascii="Times New Roman" w:hAnsi="Times New Roman"/>
+          <w:b w:val="0"/>
+          <w:i w:val="0"/>
+          <w:color w:val="1A1A1A"/>
+          <w:sz w:val="22"/>
+        </w:rPr>
+        <w:t>, Automatic Question Generation (AQG) has historically been explored through deep learning sequence-to-sequence and pre-trained encoder-decoder models (e.g., Suhartono et al., 2024). However, these traditional AQG frameworks predominantly focus on natural-language factual recall from unstructured text corpora, lacking mechanisms to enforce syntactic executability or evaluate multi-option code distractors. Lewis et al. (2020) introduced Retrieval-Augmented Generation (RAG) as a framework that combines parametric generation with retrieved external knowledge. In educational settings, this architecture allows generated content to be grounded in authoritative course resources rather than solely in model parameters.</w:t>
       </w:r>
     </w:p>
     <w:p>
@@ -567,7 +587,27 @@
           <w:color w:val="1A1A1A"/>
           <w:sz w:val="22"/>
         </w:rPr>
-        <w:t>Pradeesh et al. (2025) investigated RAG-based MCQ generation from PDF source documents within the Ample LMS, demonstrating that document-grounded question generation and LMS integration already have precedent. Lohr et al. (2025) examined course-specific semantically annotated learning objects in computer science and reported substantial need for expert intervention in generated questions. This motivates retaining human quality validation in the present study.</w:t>
+        <w:t xml:space="preserve">In higher education contexts, recent investigations in </w:t>
+      </w:r>
+      <w:r>
+        <w:rPr>
+          <w:rFonts w:ascii="Times New Roman" w:hAnsi="Times New Roman"/>
+          <w:b w:val="0"/>
+          <w:i/>
+          <w:color w:val="1A1A1A"/>
+          <w:sz w:val="22"/>
+        </w:rPr>
+        <w:t>Education and Information Technologies</w:t>
+      </w:r>
+      <w:r>
+        <w:rPr>
+          <w:rFonts w:ascii="Times New Roman" w:hAnsi="Times New Roman"/>
+          <w:b w:val="0"/>
+          <w:i w:val="0"/>
+          <w:color w:val="1A1A1A"/>
+          <w:sz w:val="22"/>
+        </w:rPr>
+        <w:t xml:space="preserve"> demonstrated that AI-generated gamified quizzes significantly enhance student engagement and can identify at-risk learners (Durgungoz &amp; Durgungoz, 2025). However, such implementations have predominantly relied on proprietary commercial software-as-a-service platforms (such as Quizizz AI), which bypass institutional data control and do not accommodate programmatic code verification. Pradeesh et al. (2025) investigated RAG-based MCQ generation from PDF source documents within the Ample LMS, demonstrating that document-grounded question generation and LMS integration already have precedent. Lohr et al. (2025) examined course-specific semantically annotated learning objects in computer science and reported substantial need for expert intervention in generated questions. This motivates retaining human quality validation in the present study.</w:t>
       </w:r>
     </w:p>
     <w:p>
@@ -631,7 +671,62 @@
           <w:color w:val="1A1A1A"/>
           <w:sz w:val="22"/>
         </w:rPr>
-        <w:t xml:space="preserve"> or cloud LTI gateways) increasingly offer automated quiz drafting wizards. However, these tools rely almost universally on third-party commercial cloud APIs (e.g., OpenAI GPT-4o, Microsoft Azure, or Anthropic Claude). This architectural choice incurs recurring per-token subscription costs and creates substantial institutional data sovereignty, privacy, and compliance barriers (e.g., FERPA, GDPR) by transmitting unpublished university curricula and exam questions off-premises. Conversely, standalone self-hosted tools such as Shintani's Lecture-to-Quiz (L2Q) pipeline (Shintani, 2026) achieve API-free local generation with deterministic quality control, but generate static CSV exports designed for Google Forms rather than integrating natively into an active learning management system. Furthermore, L2Q feeds unchunked slide text directly into the model without vector database retrieval (RAG), lacks incremental embedding caching, omits programming-specific Abstract Syntax Tree (AST) validation, and evaluates only unbatched sequential generation without hardware concurrency analysis. Other recent on-premise systems, such as Tran et al. (2026) and Shen et al. (2026), demonstrated local RAG assistants on consumer-grade GPU hardware, but focused primarily on conversational student Q&amp;A rather than structured, syntax-validated assessment generation and Question Bank persistence. These studies confirm that while local quiz generation and local educational RAG exist, persistent, resource-bounded, and course-integrated programming assessment workflows remain unaddressed.</w:t>
+        <w:t xml:space="preserve"> or cloud LTI gateways) increasingly offer automated quiz drafting wizards. However, these tools rely almost universally on third-party commercial cloud APIs (e.g., OpenAI GPT-4o, Microsoft Azure, or Anthropic Claude). This architectural choice incurs recurring per-token subscription costs and creates substantial institutional data sovereignty, privacy, and compliance barriers (e.g., FERPA, GDPR) by transmitting unpublished university curricula and exam questions off-premises. Large-scale teacher surveys reported by Bower et al. (2024) in </w:t>
+      </w:r>
+      <w:r>
+        <w:rPr>
+          <w:rFonts w:ascii="Times New Roman" w:hAnsi="Times New Roman"/>
+          <w:b w:val="0"/>
+          <w:i/>
+          <w:color w:val="1A1A1A"/>
+          <w:sz w:val="22"/>
+        </w:rPr>
+        <w:t>Education and Information Technologies</w:t>
+      </w:r>
+      <w:r>
+        <w:rPr>
+          <w:rFonts w:ascii="Times New Roman" w:hAnsi="Times New Roman"/>
+          <w:b w:val="0"/>
+          <w:i w:val="0"/>
+          <w:color w:val="1A1A1A"/>
+          <w:sz w:val="22"/>
+        </w:rPr>
+        <w:t xml:space="preserve"> emphasize that while educators recognize the transformative power of generative AI, institutional anxieties regarding academic integrity, ethical control, and data exposure remain primary inhibitors of adoption. Furthermore, as Ding et al. (2026) observed in </w:t>
+      </w:r>
+      <w:r>
+        <w:rPr>
+          <w:rFonts w:ascii="Times New Roman" w:hAnsi="Times New Roman"/>
+          <w:b w:val="0"/>
+          <w:i/>
+          <w:color w:val="1A1A1A"/>
+          <w:sz w:val="22"/>
+        </w:rPr>
+        <w:t>Education and Information Technologies</w:t>
+      </w:r>
+      <w:r>
+        <w:rPr>
+          <w:rFonts w:ascii="Times New Roman" w:hAnsi="Times New Roman"/>
+          <w:b w:val="0"/>
+          <w:i w:val="0"/>
+          <w:color w:val="1A1A1A"/>
+          <w:sz w:val="22"/>
+        </w:rPr>
+        <w:t>, effective educational AI deployment requires moving beyond naive prompt engineering toward structured, human-in-the-loop evaluative workflows that actively support critical verification.</w:t>
+      </w:r>
+    </w:p>
+    <w:p>
+      <w:pPr>
+        <w:spacing w:before="0" w:after="120" w:line="276" w:lineRule="auto"/>
+      </w:pPr>
+      <w:r>
+        <w:rPr>
+          <w:rFonts w:ascii="Times New Roman" w:hAnsi="Times New Roman"/>
+          <w:b w:val="0"/>
+          <w:i w:val="0"/>
+          <w:color w:val="1A1A1A"/>
+          <w:sz w:val="22"/>
+        </w:rPr>
+        <w:t>Conversely, standalone self-hosted tools such as Shintani's Lecture-to-Quiz (L2Q) pipeline (Shintani, 2026) achieve API-free local generation with deterministic quality control, but generate static CSV exports designed for Google Forms rather than integrating natively into an active learning management system. Furthermore, L2Q feeds unchunked slide text directly into the model without vector database retrieval (RAG), lacks incremental embedding caching, omits programming-specific Abstract Syntax Tree (AST) validation, and evaluates only unbatched sequential generation without hardware concurrency analysis. Other recent on-premise systems, such as Tran et al. (2026) and Shen et al. (2026), demonstrated local RAG assistants on consumer-grade GPU hardware, but focused primarily on conversational student Q&amp;A rather than structured, syntax-validated assessment generation and Question Bank persistence. These studies confirm that while local quiz generation and local educational RAG exist, persistent, resource-bounded, and course-integrated programming assessment workflows remain unaddressed.</w:t>
       </w:r>
     </w:p>
     <w:p>

</xml_diff>